<commit_message>
Update ERS practicum and STUDIUM project specification
</commit_message>
<xml_diff>
--- a/Elementi razvoja softvera (ERS)/Nastavni materijali/ERS_Praktikum.docx
+++ b/Elementi razvoja softvera (ERS)/Nastavni materijali/ERS_Praktikum.docx
@@ -153,18 +153,6 @@
         </w:rPr>
         <w:t>УНИВЕРЗИТЕТ У НОВОМ САДУ</w:t>
       </w:r>
-      <w:r>
-        <w:fldChar w:fldCharType="begin"/>
-      </w:r>
-      <w:r>
-        <w:instrText xml:space="preserve"> INCLUDEPICTURE "https://encrypted-tbn0.gstatic.com/images?q=tbn:ANd9GcTdtpQzxk0QZSdekPCtmvRJUugb00LDF1yB3eOwUHnd0A6ENydwaFfLk3k&amp;s=10" \* MERGEFORMATINET </w:instrText>
-      </w:r>
-      <w:r>
-        <w:fldChar w:fldCharType="separate"/>
-      </w:r>
-      <w:r>
-        <w:fldChar w:fldCharType="end"/>
-      </w:r>
     </w:p>
     <w:p>
       <w:pPr>
@@ -220,18 +208,6 @@
         <w:t xml:space="preserve"> </w:t>
       </w:r>
       <w:r>
-        <w:fldChar w:fldCharType="begin"/>
-      </w:r>
-      <w:r>
-        <w:instrText xml:space="preserve"> INCLUDEPICTURE "https://serbiagbc.rs/wp-content/uploads/2020/06/FTN-Logo.png" \* MERGEFORMATINET </w:instrText>
-      </w:r>
-      <w:r>
-        <w:fldChar w:fldCharType="separate"/>
-      </w:r>
-      <w:r>
-        <w:fldChar w:fldCharType="end"/>
-      </w:r>
-      <w:r>
         <w:rPr>
           <w:rFonts w:hint="cs"/>
           <w:b/>
@@ -301,7 +277,7 @@
           <w:szCs w:val="36"/>
         </w:rPr>
         <w:br/>
-        <w:t>Нови Сад, 2026.</w:t>
+        <w:t>Нови Сад</w:t>
       </w:r>
     </w:p>
     <w:p>
@@ -358,13 +334,6 @@
           <w:t>Предговор</w:t>
         </w:r>
       </w:hyperlink>
-      <w:r>
-        <w:rPr>
-          <w:color w:val="202020"/>
-        </w:rPr>
-        <w:tab/>
-        <w:t>2</w:t>
-      </w:r>
     </w:p>
     <w:p>
       <w:pPr>
@@ -387,7 +356,7 @@
           <w:color w:val="202020"/>
         </w:rPr>
         <w:tab/>
-        <w:t>5</w:t>
+        <w:t>1</w:t>
       </w:r>
     </w:p>
     <w:p>
@@ -411,7 +380,7 @@
           <w:color w:val="202020"/>
         </w:rPr>
         <w:tab/>
-        <w:t>5</w:t>
+        <w:t>1</w:t>
       </w:r>
     </w:p>
     <w:p>
@@ -453,7 +422,7 @@
           <w:color w:val="202020"/>
         </w:rPr>
         <w:tab/>
-        <w:t>7</w:t>
+        <w:t>3</w:t>
       </w:r>
     </w:p>
     <w:p>
@@ -478,7 +447,7 @@
           <w:color w:val="202020"/>
         </w:rPr>
         <w:tab/>
-        <w:t>7</w:t>
+        <w:t>3</w:t>
       </w:r>
     </w:p>
     <w:p>
@@ -500,7 +469,7 @@
           <w:color w:val="202020"/>
         </w:rPr>
         <w:tab/>
-        <w:t>8</w:t>
+        <w:t>4</w:t>
       </w:r>
     </w:p>
     <w:p>
@@ -538,7 +507,7 @@
           <w:color w:val="202020"/>
         </w:rPr>
         <w:tab/>
-        <w:t>11</w:t>
+        <w:t>7</w:t>
       </w:r>
     </w:p>
     <w:p>
@@ -563,7 +532,7 @@
           <w:color w:val="202020"/>
         </w:rPr>
         <w:tab/>
-        <w:t>12</w:t>
+        <w:t>8</w:t>
       </w:r>
     </w:p>
     <w:p>
@@ -605,7 +574,7 @@
           <w:color w:val="202020"/>
         </w:rPr>
         <w:tab/>
-        <w:t>14</w:t>
+        <w:t>10</w:t>
       </w:r>
     </w:p>
     <w:p>
@@ -643,7 +612,7 @@
           <w:color w:val="202020"/>
         </w:rPr>
         <w:tab/>
-        <w:t>14</w:t>
+        <w:t>10</w:t>
       </w:r>
     </w:p>
     <w:p>
@@ -668,7 +637,7 @@
           <w:color w:val="202020"/>
         </w:rPr>
         <w:tab/>
-        <w:t>16</w:t>
+        <w:t>12</w:t>
       </w:r>
     </w:p>
     <w:p>
@@ -693,7 +662,7 @@
           <w:color w:val="202020"/>
         </w:rPr>
         <w:tab/>
-        <w:t>17</w:t>
+        <w:t>13</w:t>
       </w:r>
     </w:p>
     <w:p>
@@ -751,7 +720,7 @@
           <w:color w:val="202020"/>
         </w:rPr>
         <w:tab/>
-        <w:t>18</w:t>
+        <w:t>14</w:t>
       </w:r>
     </w:p>
     <w:p>
@@ -776,7 +745,7 @@
           <w:color w:val="202020"/>
         </w:rPr>
         <w:tab/>
-        <w:t>19</w:t>
+        <w:t>15</w:t>
       </w:r>
     </w:p>
     <w:p>
@@ -801,7 +770,7 @@
           <w:color w:val="202020"/>
         </w:rPr>
         <w:tab/>
-        <w:t>19</w:t>
+        <w:t>15</w:t>
       </w:r>
     </w:p>
     <w:p>
@@ -826,7 +795,7 @@
           <w:color w:val="202020"/>
         </w:rPr>
         <w:tab/>
-        <w:t>21</w:t>
+        <w:t>17</w:t>
       </w:r>
     </w:p>
     <w:p>
@@ -853,7 +822,7 @@
           <w:color w:val="202020"/>
         </w:rPr>
         <w:tab/>
-        <w:t>22</w:t>
+        <w:t>18</w:t>
       </w:r>
     </w:p>
     <w:p>
@@ -878,7 +847,7 @@
           <w:color w:val="202020"/>
         </w:rPr>
         <w:tab/>
-        <w:t>22</w:t>
+        <w:t>18</w:t>
       </w:r>
     </w:p>
     <w:p>
@@ -916,7 +885,7 @@
           <w:color w:val="202020"/>
         </w:rPr>
         <w:tab/>
-        <w:t>23</w:t>
+        <w:t>19</w:t>
       </w:r>
     </w:p>
     <w:p>
@@ -941,7 +910,7 @@
           <w:color w:val="202020"/>
         </w:rPr>
         <w:tab/>
-        <w:t>24</w:t>
+        <w:t>20</w:t>
       </w:r>
     </w:p>
     <w:p>
@@ -998,7 +967,7 @@
           <w:color w:val="202020"/>
         </w:rPr>
         <w:tab/>
-        <w:t>26</w:t>
+        <w:t>22</w:t>
       </w:r>
     </w:p>
     <w:p>
@@ -1023,7 +992,7 @@
           <w:color w:val="202020"/>
         </w:rPr>
         <w:tab/>
-        <w:t>26</w:t>
+        <w:t>22</w:t>
       </w:r>
     </w:p>
     <w:p>
@@ -1061,7 +1030,7 @@
           <w:color w:val="202020"/>
         </w:rPr>
         <w:tab/>
-        <w:t>28</w:t>
+        <w:t>24</w:t>
       </w:r>
     </w:p>
     <w:p>
@@ -1086,7 +1055,7 @@
           <w:color w:val="202020"/>
         </w:rPr>
         <w:tab/>
-        <w:t>29</w:t>
+        <w:t>25</w:t>
       </w:r>
     </w:p>
     <w:p>
@@ -1111,7 +1080,7 @@
           <w:color w:val="202020"/>
         </w:rPr>
         <w:tab/>
-        <w:t>29</w:t>
+        <w:t>25</w:t>
       </w:r>
     </w:p>
     <w:p>
@@ -1138,7 +1107,7 @@
           <w:color w:val="202020"/>
         </w:rPr>
         <w:tab/>
-        <w:t>31</w:t>
+        <w:t>27</w:t>
       </w:r>
     </w:p>
     <w:p>
@@ -1163,7 +1132,7 @@
           <w:color w:val="202020"/>
         </w:rPr>
         <w:tab/>
-        <w:t>31</w:t>
+        <w:t>27</w:t>
       </w:r>
     </w:p>
     <w:p>
@@ -1188,7 +1157,7 @@
           <w:color w:val="202020"/>
         </w:rPr>
         <w:tab/>
-        <w:t>32</w:t>
+        <w:t>28</w:t>
       </w:r>
     </w:p>
     <w:p>
@@ -1233,7 +1202,7 @@
           <w:color w:val="202020"/>
         </w:rPr>
         <w:tab/>
-        <w:t>33</w:t>
+        <w:t>29</w:t>
       </w:r>
     </w:p>
     <w:p>
@@ -1278,7 +1247,7 @@
           <w:color w:val="202020"/>
         </w:rPr>
         <w:tab/>
-        <w:t>34</w:t>
+        <w:t>30</w:t>
       </w:r>
     </w:p>
     <w:p>
@@ -1303,7 +1272,7 @@
           <w:color w:val="202020"/>
         </w:rPr>
         <w:tab/>
-        <w:t>36</w:t>
+        <w:t>32</w:t>
       </w:r>
     </w:p>
     <w:p>
@@ -1341,7 +1310,7 @@
           <w:color w:val="202020"/>
         </w:rPr>
         <w:tab/>
-        <w:t>37</w:t>
+        <w:t>33</w:t>
       </w:r>
     </w:p>
     <w:p>
@@ -1368,7 +1337,7 @@
           <w:color w:val="202020"/>
         </w:rPr>
         <w:tab/>
-        <w:t>38</w:t>
+        <w:t>34</w:t>
       </w:r>
     </w:p>
     <w:p>
@@ -1390,7 +1359,7 @@
           <w:color w:val="202020"/>
         </w:rPr>
         <w:tab/>
-        <w:t>38</w:t>
+        <w:t>34</w:t>
       </w:r>
     </w:p>
     <w:p>
@@ -1415,7 +1384,7 @@
           <w:color w:val="202020"/>
         </w:rPr>
         <w:tab/>
-        <w:t>39</w:t>
+        <w:t>35</w:t>
       </w:r>
     </w:p>
     <w:p>
@@ -1440,7 +1409,7 @@
           <w:color w:val="202020"/>
         </w:rPr>
         <w:tab/>
-        <w:t>40</w:t>
+        <w:t>36</w:t>
       </w:r>
     </w:p>
     <w:p>
@@ -1465,7 +1434,7 @@
           <w:color w:val="202020"/>
         </w:rPr>
         <w:tab/>
-        <w:t>41</w:t>
+        <w:t>37</w:t>
       </w:r>
     </w:p>
     <w:p>
@@ -1490,7 +1459,7 @@
           <w:color w:val="202020"/>
         </w:rPr>
         <w:tab/>
-        <w:t>42</w:t>
+        <w:t>38</w:t>
       </w:r>
     </w:p>
     <w:p>
@@ -1515,7 +1484,7 @@
           <w:color w:val="202020"/>
         </w:rPr>
         <w:tab/>
-        <w:t>43</w:t>
+        <w:t>39</w:t>
       </w:r>
     </w:p>
     <w:p>
@@ -1540,7 +1509,7 @@
           <w:color w:val="202020"/>
         </w:rPr>
         <w:tab/>
-        <w:t>43</w:t>
+        <w:t>39</w:t>
       </w:r>
     </w:p>
     <w:p>
@@ -1582,7 +1551,7 @@
           <w:color w:val="202020"/>
         </w:rPr>
         <w:tab/>
-        <w:t>44</w:t>
+        <w:t>40</w:t>
       </w:r>
     </w:p>
     <w:p>
@@ -1620,7 +1589,7 @@
           <w:color w:val="202020"/>
         </w:rPr>
         <w:tab/>
-        <w:t>44</w:t>
+        <w:t>40</w:t>
       </w:r>
     </w:p>
     <w:p>
@@ -1658,7 +1627,7 @@
           <w:color w:val="202020"/>
         </w:rPr>
         <w:tab/>
-        <w:t>45</w:t>
+        <w:t>41</w:t>
       </w:r>
     </w:p>
     <w:p>
@@ -1696,7 +1665,7 @@
           <w:color w:val="202020"/>
         </w:rPr>
         <w:tab/>
-        <w:t>46</w:t>
+        <w:t>42</w:t>
       </w:r>
     </w:p>
     <w:p>
@@ -1721,7 +1690,7 @@
           <w:color w:val="202020"/>
         </w:rPr>
         <w:tab/>
-        <w:t>47</w:t>
+        <w:t>43</w:t>
       </w:r>
     </w:p>
     <w:p>
@@ -1752,7 +1721,7 @@
           <w:color w:val="202020"/>
         </w:rPr>
         <w:tab/>
-        <w:t>47</w:t>
+        <w:t>43</w:t>
       </w:r>
     </w:p>
     <w:p>
@@ -1777,7 +1746,7 @@
           <w:color w:val="202020"/>
         </w:rPr>
         <w:tab/>
-        <w:t>48</w:t>
+        <w:t>44</w:t>
       </w:r>
     </w:p>
     <w:p>
@@ -1815,7 +1784,7 @@
           <w:color w:val="202020"/>
         </w:rPr>
         <w:tab/>
-        <w:t>49</w:t>
+        <w:t>45</w:t>
       </w:r>
     </w:p>
     <w:p>
@@ -1842,7 +1811,7 @@
           <w:color w:val="202020"/>
         </w:rPr>
         <w:tab/>
-        <w:t>50</w:t>
+        <w:t>46</w:t>
       </w:r>
     </w:p>
     <w:p>
@@ -1867,7 +1836,7 @@
           <w:color w:val="202020"/>
         </w:rPr>
         <w:tab/>
-        <w:t>50</w:t>
+        <w:t>46</w:t>
       </w:r>
     </w:p>
     <w:p>
@@ -1892,7 +1861,7 @@
           <w:color w:val="202020"/>
         </w:rPr>
         <w:tab/>
-        <w:t>51</w:t>
+        <w:t>47</w:t>
       </w:r>
     </w:p>
     <w:p>
@@ -1917,7 +1886,7 @@
           <w:color w:val="202020"/>
         </w:rPr>
         <w:tab/>
-        <w:t>52</w:t>
+        <w:t>48</w:t>
       </w:r>
     </w:p>
     <w:p>
@@ -1942,7 +1911,7 @@
           <w:color w:val="202020"/>
         </w:rPr>
         <w:tab/>
-        <w:t>54</w:t>
+        <w:t>50</w:t>
       </w:r>
     </w:p>
     <w:p>
@@ -1967,7 +1936,7 @@
           <w:color w:val="202020"/>
         </w:rPr>
         <w:tab/>
-        <w:t>55</w:t>
+        <w:t>51</w:t>
       </w:r>
     </w:p>
     <w:p>
@@ -1992,7 +1961,7 @@
           <w:color w:val="202020"/>
         </w:rPr>
         <w:tab/>
-        <w:t>56</w:t>
+        <w:t>52</w:t>
       </w:r>
     </w:p>
     <w:p>
@@ -2016,7 +1985,7 @@
           <w:color w:val="202020"/>
         </w:rPr>
         <w:tab/>
-        <w:t>57</w:t>
+        <w:t>53</w:t>
       </w:r>
     </w:p>
     <w:p>
@@ -2026,6 +1995,15 @@
         <w:tabs>
           <w:tab w:val="right" w:leader="dot" w:pos="9014"/>
         </w:tabs>
+        <w:sectPr>
+          <w:headerReference w:type="default" r:id="rId10"/>
+          <w:footerReference w:type="default" r:id="rId11"/>
+          <w:pgSz w:w="11906" w:h="16838"/>
+          <w:pgMar w:top="1446" w:right="1389" w:bottom="1332" w:left="1446" w:header="737" w:footer="737" w:gutter="0"/>
+          <w:cols w:space="720"/>
+          <w:titlePg/>
+          <w:docGrid w:linePitch="360"/>
+        </w:sectPr>
       </w:pPr>
       <w:hyperlink w:anchor="h157">
         <w:r>
@@ -2049,13 +2027,12 @@
           <w:color w:val="202020"/>
         </w:rPr>
         <w:tab/>
-        <w:t>59</w:t>
+        <w:t>55</w:t>
       </w:r>
     </w:p>
     <w:p>
       <w:pPr>
         <w:pStyle w:val="Heading1"/>
-        <w:pageBreakBefore/>
         <w:jc w:val="left"/>
       </w:pPr>
       <w:bookmarkStart w:id="1" w:name="h101"/>
@@ -3395,7 +3372,7 @@
                     <pic:cNvPicPr/>
                   </pic:nvPicPr>
                   <pic:blipFill>
-                    <a:blip r:embed="rId10"/>
+                    <a:blip r:embed="rId12"/>
                     <a:stretch>
                       <a:fillRect/>
                     </a:stretch>
@@ -4126,7 +4103,7 @@
                     <pic:cNvPicPr/>
                   </pic:nvPicPr>
                   <pic:blipFill>
-                    <a:blip r:embed="rId11"/>
+                    <a:blip r:embed="rId13"/>
                     <a:stretch>
                       <a:fillRect/>
                     </a:stretch>
@@ -4193,7 +4170,7 @@
                     <pic:cNvPicPr/>
                   </pic:nvPicPr>
                   <pic:blipFill>
-                    <a:blip r:embed="rId12"/>
+                    <a:blip r:embed="rId14"/>
                     <a:stretch>
                       <a:fillRect/>
                     </a:stretch>
@@ -4817,7 +4794,7 @@
                     <pic:cNvPicPr/>
                   </pic:nvPicPr>
                   <pic:blipFill>
-                    <a:blip r:embed="rId13"/>
+                    <a:blip r:embed="rId15"/>
                     <a:stretch>
                       <a:fillRect/>
                     </a:stretch>
@@ -4903,7 +4880,7 @@
                     <pic:cNvPicPr/>
                   </pic:nvPicPr>
                   <pic:blipFill>
-                    <a:blip r:embed="rId14"/>
+                    <a:blip r:embed="rId16"/>
                     <a:stretch>
                       <a:fillRect/>
                     </a:stretch>
@@ -4993,7 +4970,7 @@
                     <pic:cNvPicPr/>
                   </pic:nvPicPr>
                   <pic:blipFill>
-                    <a:blip r:embed="rId15"/>
+                    <a:blip r:embed="rId17"/>
                     <a:stretch>
                       <a:fillRect/>
                     </a:stretch>
@@ -5788,7 +5765,7 @@
                     <pic:cNvPicPr/>
                   </pic:nvPicPr>
                   <pic:blipFill>
-                    <a:blip r:embed="rId16"/>
+                    <a:blip r:embed="rId18"/>
                     <a:stretch>
                       <a:fillRect/>
                     </a:stretch>
@@ -6582,7 +6559,7 @@
                     <pic:cNvPicPr/>
                   </pic:nvPicPr>
                   <pic:blipFill>
-                    <a:blip r:embed="rId17"/>
+                    <a:blip r:embed="rId19"/>
                     <a:stretch>
                       <a:fillRect/>
                     </a:stretch>
@@ -7117,7 +7094,6 @@
           <w:sz w:val="18"/>
         </w:rPr>
       </w:pPr>
-      <w:proofErr w:type="spellStart"/>
       <w:r>
         <w:rPr>
           <w:rFonts w:ascii="Consolas" w:eastAsia="Consolas" w:hAnsi="Consolas"/>
@@ -7127,7 +7103,6 @@
         </w:rPr>
         <w:t>public</w:t>
       </w:r>
-      <w:proofErr w:type="spellEnd"/>
       <w:r>
         <w:rPr>
           <w:rFonts w:ascii="Consolas" w:eastAsia="Consolas" w:hAnsi="Consolas"/>
@@ -7136,7 +7111,6 @@
         </w:rPr>
         <w:t xml:space="preserve"> </w:t>
       </w:r>
-      <w:proofErr w:type="spellStart"/>
       <w:r>
         <w:rPr>
           <w:rFonts w:ascii="Consolas" w:eastAsia="Consolas" w:hAnsi="Consolas"/>
@@ -7146,25 +7120,14 @@
         </w:rPr>
         <w:t>interface</w:t>
       </w:r>
-      <w:proofErr w:type="spellEnd"/>
-      <w:r>
-        <w:rPr>
-          <w:rFonts w:ascii="Consolas" w:eastAsia="Consolas" w:hAnsi="Consolas"/>
-          <w:color w:val="232323"/>
-          <w:sz w:val="18"/>
-        </w:rPr>
-        <w:t xml:space="preserve"> </w:t>
-      </w:r>
-      <w:proofErr w:type="spellStart"/>
-      <w:r>
-        <w:rPr>
-          <w:rFonts w:ascii="Consolas" w:eastAsia="Consolas" w:hAnsi="Consolas"/>
-          <w:color w:val="232323"/>
-          <w:sz w:val="18"/>
-        </w:rPr>
-        <w:t>IPretrazivac</w:t>
-      </w:r>
-      <w:proofErr w:type="spellEnd"/>
+      <w:r>
+        <w:rPr>
+          <w:rFonts w:ascii="Consolas" w:eastAsia="Consolas" w:hAnsi="Consolas"/>
+          <w:color w:val="232323"/>
+          <w:sz w:val="18"/>
+        </w:rPr>
+        <w:t xml:space="preserve"> IPretrazivac</w:t>
+      </w:r>
       <w:r>
         <w:rPr>
           <w:rFonts w:ascii="Consolas" w:eastAsia="Consolas" w:hAnsi="Consolas"/>
@@ -7183,7 +7146,6 @@
         <w:br/>
         <w:t xml:space="preserve">    </w:t>
       </w:r>
-      <w:proofErr w:type="spellStart"/>
       <w:r>
         <w:rPr>
           <w:rFonts w:ascii="Consolas" w:eastAsia="Consolas" w:hAnsi="Consolas"/>
@@ -7193,7 +7155,6 @@
         </w:rPr>
         <w:t>int</w:t>
       </w:r>
-      <w:proofErr w:type="spellEnd"/>
       <w:r>
         <w:rPr>
           <w:rFonts w:ascii="Consolas" w:eastAsia="Consolas" w:hAnsi="Consolas"/>
@@ -7202,7 +7163,6 @@
         </w:rPr>
         <w:t xml:space="preserve"> </w:t>
       </w:r>
-      <w:proofErr w:type="spellStart"/>
       <w:r>
         <w:rPr>
           <w:rFonts w:ascii="Consolas" w:eastAsia="Consolas" w:hAnsi="Consolas"/>
@@ -7211,7 +7171,6 @@
         </w:rPr>
         <w:t>Prebroj</w:t>
       </w:r>
-      <w:proofErr w:type="spellEnd"/>
       <w:r>
         <w:rPr>
           <w:rFonts w:ascii="Consolas" w:eastAsia="Consolas" w:hAnsi="Consolas"/>
@@ -7220,7 +7179,6 @@
         </w:rPr>
         <w:t>(</w:t>
       </w:r>
-      <w:proofErr w:type="spellStart"/>
       <w:r>
         <w:rPr>
           <w:rFonts w:ascii="Consolas" w:eastAsia="Consolas" w:hAnsi="Consolas"/>
@@ -7230,52 +7188,14 @@
         </w:rPr>
         <w:t>string</w:t>
       </w:r>
-      <w:proofErr w:type="spellEnd"/>
-      <w:r>
-        <w:rPr>
-          <w:rFonts w:ascii="Consolas" w:eastAsia="Consolas" w:hAnsi="Consolas"/>
-          <w:color w:val="232323"/>
-          <w:sz w:val="18"/>
-        </w:rPr>
-        <w:t xml:space="preserve"> </w:t>
-      </w:r>
-      <w:proofErr w:type="spellStart"/>
-      <w:r>
-        <w:rPr>
-          <w:rFonts w:ascii="Consolas" w:eastAsia="Consolas" w:hAnsi="Consolas"/>
-          <w:color w:val="232323"/>
-          <w:sz w:val="18"/>
-        </w:rPr>
-        <w:t>pojam</w:t>
-      </w:r>
-      <w:proofErr w:type="spellEnd"/>
-      <w:r>
-        <w:rPr>
-          <w:rFonts w:ascii="Consolas" w:eastAsia="Consolas" w:hAnsi="Consolas"/>
-          <w:color w:val="232323"/>
-          <w:sz w:val="18"/>
-        </w:rPr>
-        <w:t xml:space="preserve">, </w:t>
-      </w:r>
-      <w:proofErr w:type="spellStart"/>
-      <w:r>
-        <w:rPr>
-          <w:rFonts w:ascii="Consolas" w:eastAsia="Consolas" w:hAnsi="Consolas"/>
-          <w:color w:val="232323"/>
-          <w:sz w:val="18"/>
-        </w:rPr>
-        <w:t>IReadOnlyList</w:t>
-      </w:r>
-      <w:proofErr w:type="spellEnd"/>
-      <w:r>
-        <w:rPr>
-          <w:rFonts w:ascii="Consolas" w:eastAsia="Consolas" w:hAnsi="Consolas"/>
-          <w:color w:val="232323"/>
-          <w:sz w:val="18"/>
-        </w:rPr>
-        <w:t>&lt;</w:t>
-      </w:r>
-      <w:proofErr w:type="spellStart"/>
+      <w:r>
+        <w:rPr>
+          <w:rFonts w:ascii="Consolas" w:eastAsia="Consolas" w:hAnsi="Consolas"/>
+          <w:color w:val="232323"/>
+          <w:sz w:val="18"/>
+        </w:rPr>
+        <w:t xml:space="preserve"> pojam, IReadOnlyList&lt;</w:t>
+      </w:r>
       <w:r>
         <w:rPr>
           <w:rFonts w:ascii="Consolas" w:eastAsia="Consolas" w:hAnsi="Consolas"/>
@@ -7285,32 +7205,13 @@
         </w:rPr>
         <w:t>string</w:t>
       </w:r>
-      <w:proofErr w:type="spellEnd"/>
-      <w:r>
-        <w:rPr>
-          <w:rFonts w:ascii="Consolas" w:eastAsia="Consolas" w:hAnsi="Consolas"/>
-          <w:color w:val="232323"/>
-          <w:sz w:val="18"/>
-        </w:rPr>
-        <w:t xml:space="preserve">&gt; </w:t>
-      </w:r>
-      <w:proofErr w:type="spellStart"/>
-      <w:r>
-        <w:rPr>
-          <w:rFonts w:ascii="Consolas" w:eastAsia="Consolas" w:hAnsi="Consolas"/>
-          <w:color w:val="232323"/>
-          <w:sz w:val="18"/>
-        </w:rPr>
-        <w:t>vrednosti</w:t>
-      </w:r>
-      <w:proofErr w:type="spellEnd"/>
-      <w:r>
-        <w:rPr>
-          <w:rFonts w:ascii="Consolas" w:eastAsia="Consolas" w:hAnsi="Consolas"/>
-          <w:color w:val="232323"/>
-          <w:sz w:val="18"/>
-        </w:rPr>
-        <w:t>);</w:t>
+      <w:r>
+        <w:rPr>
+          <w:rFonts w:ascii="Consolas" w:eastAsia="Consolas" w:hAnsi="Consolas"/>
+          <w:color w:val="232323"/>
+          <w:sz w:val="18"/>
+        </w:rPr>
+        <w:t>&gt; vrednosti);</w:t>
       </w:r>
       <w:r>
         <w:rPr>
@@ -7337,7 +7238,6 @@
         </w:rPr>
         <w:br/>
       </w:r>
-      <w:proofErr w:type="spellStart"/>
       <w:r>
         <w:rPr>
           <w:rFonts w:ascii="Consolas" w:eastAsia="Consolas" w:hAnsi="Consolas"/>
@@ -7347,7 +7247,6 @@
         </w:rPr>
         <w:t>public</w:t>
       </w:r>
-      <w:proofErr w:type="spellEnd"/>
       <w:r>
         <w:rPr>
           <w:rFonts w:ascii="Consolas" w:eastAsia="Consolas" w:hAnsi="Consolas"/>
@@ -7356,7 +7255,6 @@
         </w:rPr>
         <w:t xml:space="preserve"> </w:t>
       </w:r>
-      <w:proofErr w:type="spellStart"/>
       <w:r>
         <w:rPr>
           <w:rFonts w:ascii="Consolas" w:eastAsia="Consolas" w:hAnsi="Consolas"/>
@@ -7366,7 +7264,6 @@
         </w:rPr>
         <w:t>sealed</w:t>
       </w:r>
-      <w:proofErr w:type="spellEnd"/>
       <w:r>
         <w:rPr>
           <w:rFonts w:ascii="Consolas" w:eastAsia="Consolas" w:hAnsi="Consolas"/>
@@ -7375,7 +7272,6 @@
         </w:rPr>
         <w:t xml:space="preserve"> </w:t>
       </w:r>
-      <w:proofErr w:type="spellStart"/>
       <w:r>
         <w:rPr>
           <w:rFonts w:ascii="Consolas" w:eastAsia="Consolas" w:hAnsi="Consolas"/>
@@ -7385,7 +7281,6 @@
         </w:rPr>
         <w:t>class</w:t>
       </w:r>
-      <w:proofErr w:type="spellEnd"/>
       <w:r>
         <w:rPr>
           <w:rFonts w:ascii="Consolas" w:eastAsia="Consolas" w:hAnsi="Consolas"/>
@@ -7394,7 +7289,6 @@
         </w:rPr>
         <w:t xml:space="preserve"> </w:t>
       </w:r>
-      <w:proofErr w:type="spellStart"/>
       <w:r>
         <w:rPr>
           <w:rFonts w:ascii="Consolas" w:eastAsia="Consolas" w:hAnsi="Consolas"/>
@@ -7403,25 +7297,14 @@
         </w:rPr>
         <w:t>LinearniPretrazivac</w:t>
       </w:r>
-      <w:proofErr w:type="spellEnd"/>
-      <w:r>
-        <w:rPr>
-          <w:rFonts w:ascii="Consolas" w:eastAsia="Consolas" w:hAnsi="Consolas"/>
-          <w:color w:val="232323"/>
-          <w:sz w:val="18"/>
-        </w:rPr>
-        <w:t xml:space="preserve"> : </w:t>
-      </w:r>
-      <w:proofErr w:type="spellStart"/>
-      <w:r>
-        <w:rPr>
-          <w:rFonts w:ascii="Consolas" w:eastAsia="Consolas" w:hAnsi="Consolas"/>
-          <w:color w:val="232323"/>
-          <w:sz w:val="18"/>
-        </w:rPr>
-        <w:t>IPretrazivac</w:t>
-      </w:r>
-      <w:proofErr w:type="spellEnd"/>
+      <w:r>
+        <w:rPr>
+          <w:rFonts w:ascii="Consolas" w:eastAsia="Consolas" w:hAnsi="Consolas"/>
+          <w:color w:val="232323"/>
+          <w:sz w:val="18"/>
+        </w:rPr>
+        <w:t xml:space="preserve"> : IPretrazivac</w:t>
+      </w:r>
       <w:r>
         <w:rPr>
           <w:rFonts w:ascii="Consolas" w:eastAsia="Consolas" w:hAnsi="Consolas"/>
@@ -7440,7 +7323,6 @@
         <w:br/>
         <w:t xml:space="preserve">    </w:t>
       </w:r>
-      <w:proofErr w:type="spellStart"/>
       <w:r>
         <w:rPr>
           <w:rFonts w:ascii="Consolas" w:eastAsia="Consolas" w:hAnsi="Consolas"/>
@@ -7450,7 +7332,6 @@
         </w:rPr>
         <w:t>public</w:t>
       </w:r>
-      <w:proofErr w:type="spellEnd"/>
       <w:r>
         <w:rPr>
           <w:rFonts w:ascii="Consolas" w:eastAsia="Consolas" w:hAnsi="Consolas"/>
@@ -7459,7 +7340,6 @@
         </w:rPr>
         <w:t xml:space="preserve"> </w:t>
       </w:r>
-      <w:proofErr w:type="spellStart"/>
       <w:r>
         <w:rPr>
           <w:rFonts w:ascii="Consolas" w:eastAsia="Consolas" w:hAnsi="Consolas"/>
@@ -7469,7 +7349,6 @@
         </w:rPr>
         <w:t>int</w:t>
       </w:r>
-      <w:proofErr w:type="spellEnd"/>
       <w:r>
         <w:rPr>
           <w:rFonts w:ascii="Consolas" w:eastAsia="Consolas" w:hAnsi="Consolas"/>
@@ -7478,7 +7357,6 @@
         </w:rPr>
         <w:t xml:space="preserve"> </w:t>
       </w:r>
-      <w:proofErr w:type="spellStart"/>
       <w:r>
         <w:rPr>
           <w:rFonts w:ascii="Consolas" w:eastAsia="Consolas" w:hAnsi="Consolas"/>
@@ -7487,7 +7365,6 @@
         </w:rPr>
         <w:t>Prebroj</w:t>
       </w:r>
-      <w:proofErr w:type="spellEnd"/>
       <w:r>
         <w:rPr>
           <w:rFonts w:ascii="Consolas" w:eastAsia="Consolas" w:hAnsi="Consolas"/>
@@ -7496,7 +7373,6 @@
         </w:rPr>
         <w:t>(</w:t>
       </w:r>
-      <w:proofErr w:type="spellStart"/>
       <w:r>
         <w:rPr>
           <w:rFonts w:ascii="Consolas" w:eastAsia="Consolas" w:hAnsi="Consolas"/>
@@ -7506,52 +7382,14 @@
         </w:rPr>
         <w:t>string</w:t>
       </w:r>
-      <w:proofErr w:type="spellEnd"/>
-      <w:r>
-        <w:rPr>
-          <w:rFonts w:ascii="Consolas" w:eastAsia="Consolas" w:hAnsi="Consolas"/>
-          <w:color w:val="232323"/>
-          <w:sz w:val="18"/>
-        </w:rPr>
-        <w:t xml:space="preserve"> </w:t>
-      </w:r>
-      <w:proofErr w:type="spellStart"/>
-      <w:r>
-        <w:rPr>
-          <w:rFonts w:ascii="Consolas" w:eastAsia="Consolas" w:hAnsi="Consolas"/>
-          <w:color w:val="232323"/>
-          <w:sz w:val="18"/>
-        </w:rPr>
-        <w:t>pojam</w:t>
-      </w:r>
-      <w:proofErr w:type="spellEnd"/>
-      <w:r>
-        <w:rPr>
-          <w:rFonts w:ascii="Consolas" w:eastAsia="Consolas" w:hAnsi="Consolas"/>
-          <w:color w:val="232323"/>
-          <w:sz w:val="18"/>
-        </w:rPr>
-        <w:t xml:space="preserve">, </w:t>
-      </w:r>
-      <w:proofErr w:type="spellStart"/>
-      <w:r>
-        <w:rPr>
-          <w:rFonts w:ascii="Consolas" w:eastAsia="Consolas" w:hAnsi="Consolas"/>
-          <w:color w:val="232323"/>
-          <w:sz w:val="18"/>
-        </w:rPr>
-        <w:t>IReadOnlyList</w:t>
-      </w:r>
-      <w:proofErr w:type="spellEnd"/>
-      <w:r>
-        <w:rPr>
-          <w:rFonts w:ascii="Consolas" w:eastAsia="Consolas" w:hAnsi="Consolas"/>
-          <w:color w:val="232323"/>
-          <w:sz w:val="18"/>
-        </w:rPr>
-        <w:t>&lt;</w:t>
-      </w:r>
-      <w:proofErr w:type="spellStart"/>
+      <w:r>
+        <w:rPr>
+          <w:rFonts w:ascii="Consolas" w:eastAsia="Consolas" w:hAnsi="Consolas"/>
+          <w:color w:val="232323"/>
+          <w:sz w:val="18"/>
+        </w:rPr>
+        <w:t xml:space="preserve"> pojam, IReadOnlyList&lt;</w:t>
+      </w:r>
       <w:r>
         <w:rPr>
           <w:rFonts w:ascii="Consolas" w:eastAsia="Consolas" w:hAnsi="Consolas"/>
@@ -7561,77 +7399,22 @@
         </w:rPr>
         <w:t>string</w:t>
       </w:r>
-      <w:proofErr w:type="spellEnd"/>
-      <w:r>
-        <w:rPr>
-          <w:rFonts w:ascii="Consolas" w:eastAsia="Consolas" w:hAnsi="Consolas"/>
-          <w:color w:val="232323"/>
-          <w:sz w:val="18"/>
-        </w:rPr>
-        <w:t xml:space="preserve">&gt; </w:t>
-      </w:r>
-      <w:proofErr w:type="spellStart"/>
-      <w:r>
-        <w:rPr>
-          <w:rFonts w:ascii="Consolas" w:eastAsia="Consolas" w:hAnsi="Consolas"/>
-          <w:color w:val="232323"/>
-          <w:sz w:val="18"/>
-        </w:rPr>
-        <w:t>vrednosti</w:t>
-      </w:r>
-      <w:proofErr w:type="spellEnd"/>
-      <w:r>
-        <w:rPr>
-          <w:rFonts w:ascii="Consolas" w:eastAsia="Consolas" w:hAnsi="Consolas"/>
-          <w:color w:val="232323"/>
-          <w:sz w:val="18"/>
-        </w:rPr>
-        <w:t>)</w:t>
-      </w:r>
-      <w:r>
-        <w:rPr>
-          <w:rFonts w:ascii="Consolas" w:eastAsia="Consolas" w:hAnsi="Consolas"/>
-          <w:color w:val="232323"/>
-          <w:sz w:val="18"/>
-        </w:rPr>
-        <w:br/>
-        <w:t xml:space="preserve">        =&gt; </w:t>
-      </w:r>
-      <w:proofErr w:type="spellStart"/>
-      <w:r>
-        <w:rPr>
-          <w:rFonts w:ascii="Consolas" w:eastAsia="Consolas" w:hAnsi="Consolas"/>
-          <w:color w:val="232323"/>
-          <w:sz w:val="18"/>
-        </w:rPr>
-        <w:t>vrednosti.Count</w:t>
-      </w:r>
-      <w:proofErr w:type="spellEnd"/>
-      <w:r>
-        <w:rPr>
-          <w:rFonts w:ascii="Consolas" w:eastAsia="Consolas" w:hAnsi="Consolas"/>
-          <w:color w:val="232323"/>
-          <w:sz w:val="18"/>
-        </w:rPr>
-        <w:t xml:space="preserve">(v =&gt; v == </w:t>
-      </w:r>
-      <w:proofErr w:type="spellStart"/>
-      <w:r>
-        <w:rPr>
-          <w:rFonts w:ascii="Consolas" w:eastAsia="Consolas" w:hAnsi="Consolas"/>
-          <w:color w:val="232323"/>
-          <w:sz w:val="18"/>
-        </w:rPr>
-        <w:t>pojam</w:t>
-      </w:r>
-      <w:proofErr w:type="spellEnd"/>
-      <w:r>
-        <w:rPr>
-          <w:rFonts w:ascii="Consolas" w:eastAsia="Consolas" w:hAnsi="Consolas"/>
-          <w:color w:val="232323"/>
-          <w:sz w:val="18"/>
-        </w:rPr>
-        <w:t>);</w:t>
+      <w:r>
+        <w:rPr>
+          <w:rFonts w:ascii="Consolas" w:eastAsia="Consolas" w:hAnsi="Consolas"/>
+          <w:color w:val="232323"/>
+          <w:sz w:val="18"/>
+        </w:rPr>
+        <w:t>&gt; vrednosti)</w:t>
+      </w:r>
+      <w:r>
+        <w:rPr>
+          <w:rFonts w:ascii="Consolas" w:eastAsia="Consolas" w:hAnsi="Consolas"/>
+          <w:color w:val="232323"/>
+          <w:sz w:val="18"/>
+        </w:rPr>
+        <w:br/>
+        <w:t xml:space="preserve">        =&gt; vrednosti.Count(v =&gt; v == pojam);</w:t>
       </w:r>
       <w:r>
         <w:rPr>
@@ -7658,7 +7441,6 @@
         </w:rPr>
         <w:br/>
       </w:r>
-      <w:proofErr w:type="spellStart"/>
       <w:r>
         <w:rPr>
           <w:rFonts w:ascii="Consolas" w:eastAsia="Consolas" w:hAnsi="Consolas"/>
@@ -7668,7 +7450,6 @@
         </w:rPr>
         <w:t>public</w:t>
       </w:r>
-      <w:proofErr w:type="spellEnd"/>
       <w:r>
         <w:rPr>
           <w:rFonts w:ascii="Consolas" w:eastAsia="Consolas" w:hAnsi="Consolas"/>
@@ -7677,7 +7458,6 @@
         </w:rPr>
         <w:t xml:space="preserve"> </w:t>
       </w:r>
-      <w:proofErr w:type="spellStart"/>
       <w:r>
         <w:rPr>
           <w:rFonts w:ascii="Consolas" w:eastAsia="Consolas" w:hAnsi="Consolas"/>
@@ -7687,7 +7467,6 @@
         </w:rPr>
         <w:t>static</w:t>
       </w:r>
-      <w:proofErr w:type="spellEnd"/>
       <w:r>
         <w:rPr>
           <w:rFonts w:ascii="Consolas" w:eastAsia="Consolas" w:hAnsi="Consolas"/>
@@ -7696,7 +7475,6 @@
         </w:rPr>
         <w:t xml:space="preserve"> </w:t>
       </w:r>
-      <w:proofErr w:type="spellStart"/>
       <w:r>
         <w:rPr>
           <w:rFonts w:ascii="Consolas" w:eastAsia="Consolas" w:hAnsi="Consolas"/>
@@ -7706,7 +7484,6 @@
         </w:rPr>
         <w:t>int</w:t>
       </w:r>
-      <w:proofErr w:type="spellEnd"/>
       <w:r>
         <w:rPr>
           <w:rFonts w:ascii="Consolas" w:eastAsia="Consolas" w:hAnsi="Consolas"/>
@@ -7715,7 +7492,6 @@
         </w:rPr>
         <w:t xml:space="preserve"> </w:t>
       </w:r>
-      <w:proofErr w:type="spellStart"/>
       <w:r>
         <w:rPr>
           <w:rFonts w:ascii="Consolas" w:eastAsia="Consolas" w:hAnsi="Consolas"/>
@@ -7724,25 +7500,14 @@
         </w:rPr>
         <w:t>PronadjiBrojPogodaka</w:t>
       </w:r>
-      <w:proofErr w:type="spellEnd"/>
-      <w:r>
-        <w:rPr>
-          <w:rFonts w:ascii="Consolas" w:eastAsia="Consolas" w:hAnsi="Consolas"/>
-          <w:color w:val="232323"/>
-          <w:sz w:val="18"/>
-        </w:rPr>
-        <w:t>(</w:t>
-      </w:r>
-      <w:proofErr w:type="spellStart"/>
-      <w:r>
-        <w:rPr>
-          <w:rFonts w:ascii="Consolas" w:eastAsia="Consolas" w:hAnsi="Consolas"/>
-          <w:color w:val="232323"/>
-          <w:sz w:val="18"/>
-        </w:rPr>
-        <w:t>IPretrazivac</w:t>
-      </w:r>
-      <w:proofErr w:type="spellEnd"/>
+      <w:r>
+        <w:rPr>
+          <w:rFonts w:ascii="Consolas" w:eastAsia="Consolas" w:hAnsi="Consolas"/>
+          <w:color w:val="232323"/>
+          <w:sz w:val="18"/>
+        </w:rPr>
+        <w:t>(IPretrazivac pretrazivac,</w:t>
+      </w:r>
       <w:r>
         <w:rPr>
           <w:rFonts w:ascii="Consolas" w:eastAsia="Consolas" w:hAnsi="Consolas"/>
@@ -7751,33 +7516,6 @@
         </w:rPr>
         <w:t xml:space="preserve"> </w:t>
       </w:r>
-      <w:proofErr w:type="spellStart"/>
-      <w:r>
-        <w:rPr>
-          <w:rFonts w:ascii="Consolas" w:eastAsia="Consolas" w:hAnsi="Consolas"/>
-          <w:color w:val="232323"/>
-          <w:sz w:val="18"/>
-        </w:rPr>
-        <w:t>pretrazivac</w:t>
-      </w:r>
-      <w:proofErr w:type="spellEnd"/>
-      <w:r>
-        <w:rPr>
-          <w:rFonts w:ascii="Consolas" w:eastAsia="Consolas" w:hAnsi="Consolas"/>
-          <w:color w:val="232323"/>
-          <w:sz w:val="18"/>
-        </w:rPr>
-        <w:t>,</w:t>
-      </w:r>
-      <w:r>
-        <w:rPr>
-          <w:rFonts w:ascii="Consolas" w:eastAsia="Consolas" w:hAnsi="Consolas"/>
-          <w:color w:val="232323"/>
-          <w:sz w:val="18"/>
-        </w:rPr>
-        <w:t xml:space="preserve"> </w:t>
-      </w:r>
-      <w:proofErr w:type="spellStart"/>
       <w:r>
         <w:rPr>
           <w:rFonts w:ascii="Consolas" w:eastAsia="Consolas" w:hAnsi="Consolas"/>
@@ -7787,32 +7525,13 @@
         </w:rPr>
         <w:t>string</w:t>
       </w:r>
-      <w:proofErr w:type="spellEnd"/>
-      <w:r>
-        <w:rPr>
-          <w:rFonts w:ascii="Consolas" w:eastAsia="Consolas" w:hAnsi="Consolas"/>
-          <w:color w:val="232323"/>
-          <w:sz w:val="18"/>
-        </w:rPr>
-        <w:t xml:space="preserve"> </w:t>
-      </w:r>
-      <w:proofErr w:type="spellStart"/>
-      <w:r>
-        <w:rPr>
-          <w:rFonts w:ascii="Consolas" w:eastAsia="Consolas" w:hAnsi="Consolas"/>
-          <w:color w:val="232323"/>
-          <w:sz w:val="18"/>
-        </w:rPr>
-        <w:t>pojam</w:t>
-      </w:r>
-      <w:proofErr w:type="spellEnd"/>
-      <w:r>
-        <w:rPr>
-          <w:rFonts w:ascii="Consolas" w:eastAsia="Consolas" w:hAnsi="Consolas"/>
-          <w:color w:val="232323"/>
-          <w:sz w:val="18"/>
-        </w:rPr>
-        <w:t>,</w:t>
+      <w:r>
+        <w:rPr>
+          <w:rFonts w:ascii="Consolas" w:eastAsia="Consolas" w:hAnsi="Consolas"/>
+          <w:color w:val="232323"/>
+          <w:sz w:val="18"/>
+        </w:rPr>
+        <w:t xml:space="preserve"> pojam,</w:t>
       </w:r>
       <w:r>
         <w:rPr>
@@ -7831,25 +7550,14 @@
         <w:br/>
         <w:t xml:space="preserve">                                       </w:t>
       </w:r>
-      <w:proofErr w:type="spellStart"/>
-      <w:r>
-        <w:rPr>
-          <w:rFonts w:ascii="Consolas" w:eastAsia="Consolas" w:hAnsi="Consolas"/>
-          <w:color w:val="232323"/>
-          <w:sz w:val="18"/>
-        </w:rPr>
-        <w:t>IReadOnlyList</w:t>
-      </w:r>
-      <w:proofErr w:type="spellEnd"/>
-      <w:r>
-        <w:rPr>
-          <w:rFonts w:ascii="Consolas" w:eastAsia="Consolas" w:hAnsi="Consolas"/>
-          <w:color w:val="232323"/>
-          <w:sz w:val="18"/>
-        </w:rPr>
-        <w:t>&lt;</w:t>
-      </w:r>
-      <w:proofErr w:type="spellStart"/>
+      <w:r>
+        <w:rPr>
+          <w:rFonts w:ascii="Consolas" w:eastAsia="Consolas" w:hAnsi="Consolas"/>
+          <w:color w:val="232323"/>
+          <w:sz w:val="18"/>
+        </w:rPr>
+        <w:t>IReadOnlyList&lt;</w:t>
+      </w:r>
       <w:r>
         <w:rPr>
           <w:rFonts w:ascii="Consolas" w:eastAsia="Consolas" w:hAnsi="Consolas"/>
@@ -7859,95 +7567,22 @@
         </w:rPr>
         <w:t>string</w:t>
       </w:r>
-      <w:proofErr w:type="spellEnd"/>
-      <w:r>
-        <w:rPr>
-          <w:rFonts w:ascii="Consolas" w:eastAsia="Consolas" w:hAnsi="Consolas"/>
-          <w:color w:val="232323"/>
-          <w:sz w:val="18"/>
-        </w:rPr>
-        <w:t xml:space="preserve">&gt; </w:t>
-      </w:r>
-      <w:proofErr w:type="spellStart"/>
-      <w:r>
-        <w:rPr>
-          <w:rFonts w:ascii="Consolas" w:eastAsia="Consolas" w:hAnsi="Consolas"/>
-          <w:color w:val="232323"/>
-          <w:sz w:val="18"/>
-        </w:rPr>
-        <w:t>vrednosti</w:t>
-      </w:r>
-      <w:proofErr w:type="spellEnd"/>
-      <w:r>
-        <w:rPr>
-          <w:rFonts w:ascii="Consolas" w:eastAsia="Consolas" w:hAnsi="Consolas"/>
-          <w:color w:val="232323"/>
-          <w:sz w:val="18"/>
-        </w:rPr>
-        <w:t>)</w:t>
-      </w:r>
-      <w:r>
-        <w:rPr>
-          <w:rFonts w:ascii="Consolas" w:eastAsia="Consolas" w:hAnsi="Consolas"/>
-          <w:color w:val="232323"/>
-          <w:sz w:val="18"/>
-        </w:rPr>
-        <w:br/>
-        <w:t xml:space="preserve">    =&gt; </w:t>
-      </w:r>
-      <w:proofErr w:type="spellStart"/>
-      <w:r>
-        <w:rPr>
-          <w:rFonts w:ascii="Consolas" w:eastAsia="Consolas" w:hAnsi="Consolas"/>
-          <w:color w:val="232323"/>
-          <w:sz w:val="18"/>
-        </w:rPr>
-        <w:t>pretrazivac.Prebroj</w:t>
-      </w:r>
-      <w:proofErr w:type="spellEnd"/>
-      <w:r>
-        <w:rPr>
-          <w:rFonts w:ascii="Consolas" w:eastAsia="Consolas" w:hAnsi="Consolas"/>
-          <w:color w:val="232323"/>
-          <w:sz w:val="18"/>
-        </w:rPr>
-        <w:t>(</w:t>
-      </w:r>
-      <w:proofErr w:type="spellStart"/>
-      <w:r>
-        <w:rPr>
-          <w:rFonts w:ascii="Consolas" w:eastAsia="Consolas" w:hAnsi="Consolas"/>
-          <w:color w:val="232323"/>
-          <w:sz w:val="18"/>
-        </w:rPr>
-        <w:t>pojam</w:t>
-      </w:r>
-      <w:proofErr w:type="spellEnd"/>
-      <w:r>
-        <w:rPr>
-          <w:rFonts w:ascii="Consolas" w:eastAsia="Consolas" w:hAnsi="Consolas"/>
-          <w:color w:val="232323"/>
-          <w:sz w:val="18"/>
-        </w:rPr>
-        <w:t xml:space="preserve">, </w:t>
-      </w:r>
-      <w:proofErr w:type="spellStart"/>
-      <w:r>
-        <w:rPr>
-          <w:rFonts w:ascii="Consolas" w:eastAsia="Consolas" w:hAnsi="Consolas"/>
-          <w:color w:val="232323"/>
-          <w:sz w:val="18"/>
-        </w:rPr>
-        <w:t>vrednosti</w:t>
-      </w:r>
-      <w:proofErr w:type="spellEnd"/>
-      <w:r>
-        <w:rPr>
-          <w:rFonts w:ascii="Consolas" w:eastAsia="Consolas" w:hAnsi="Consolas"/>
-          <w:color w:val="232323"/>
-          <w:sz w:val="18"/>
-        </w:rPr>
-        <w:t>);</w:t>
+      <w:r>
+        <w:rPr>
+          <w:rFonts w:ascii="Consolas" w:eastAsia="Consolas" w:hAnsi="Consolas"/>
+          <w:color w:val="232323"/>
+          <w:sz w:val="18"/>
+        </w:rPr>
+        <w:t>&gt; vrednosti)</w:t>
+      </w:r>
+      <w:r>
+        <w:rPr>
+          <w:rFonts w:ascii="Consolas" w:eastAsia="Consolas" w:hAnsi="Consolas"/>
+          <w:color w:val="232323"/>
+          <w:sz w:val="18"/>
+        </w:rPr>
+        <w:br/>
+        <w:t xml:space="preserve">    =&gt; pretrazivac.Prebroj(pojam, vrednosti);</w:t>
       </w:r>
     </w:p>
     <w:p>
@@ -8031,7 +7666,7 @@
                     <pic:cNvPicPr/>
                   </pic:nvPicPr>
                   <pic:blipFill>
-                    <a:blip r:embed="rId18"/>
+                    <a:blip r:embed="rId20"/>
                     <a:stretch>
                       <a:fillRect/>
                     </a:stretch>
@@ -10696,7 +10331,7 @@
                     <pic:cNvPicPr/>
                   </pic:nvPicPr>
                   <pic:blipFill>
-                    <a:blip r:embed="rId19"/>
+                    <a:blip r:embed="rId21"/>
                     <a:stretch>
                       <a:fillRect/>
                     </a:stretch>
@@ -10839,7 +10474,6 @@
         <w:ind w:left="204" w:right="45"/>
         <w:jc w:val="left"/>
       </w:pPr>
-      <w:proofErr w:type="spellStart"/>
       <w:r>
         <w:rPr>
           <w:rFonts w:ascii="Consolas" w:eastAsia="Consolas" w:hAnsi="Consolas"/>
@@ -10849,7 +10483,6 @@
         </w:rPr>
         <w:t>public</w:t>
       </w:r>
-      <w:proofErr w:type="spellEnd"/>
       <w:r>
         <w:rPr>
           <w:rFonts w:ascii="Consolas" w:eastAsia="Consolas" w:hAnsi="Consolas"/>
@@ -10858,7 +10491,6 @@
         </w:rPr>
         <w:t xml:space="preserve"> </w:t>
       </w:r>
-      <w:proofErr w:type="spellStart"/>
       <w:r>
         <w:rPr>
           <w:rFonts w:ascii="Consolas" w:eastAsia="Consolas" w:hAnsi="Consolas"/>
@@ -10868,25 +10500,14 @@
         </w:rPr>
         <w:t>interface</w:t>
       </w:r>
-      <w:proofErr w:type="spellEnd"/>
-      <w:r>
-        <w:rPr>
-          <w:rFonts w:ascii="Consolas" w:eastAsia="Consolas" w:hAnsi="Consolas"/>
-          <w:color w:val="232323"/>
-          <w:sz w:val="18"/>
-        </w:rPr>
-        <w:t xml:space="preserve"> </w:t>
-      </w:r>
-      <w:proofErr w:type="spellStart"/>
-      <w:r>
-        <w:rPr>
-          <w:rFonts w:ascii="Consolas" w:eastAsia="Consolas" w:hAnsi="Consolas"/>
-          <w:color w:val="232323"/>
-          <w:sz w:val="18"/>
-        </w:rPr>
-        <w:t>IZapisiServis</w:t>
-      </w:r>
-      <w:proofErr w:type="spellEnd"/>
+      <w:r>
+        <w:rPr>
+          <w:rFonts w:ascii="Consolas" w:eastAsia="Consolas" w:hAnsi="Consolas"/>
+          <w:color w:val="232323"/>
+          <w:sz w:val="18"/>
+        </w:rPr>
+        <w:t xml:space="preserve"> IZapisiServis</w:t>
+      </w:r>
       <w:r>
         <w:rPr>
           <w:rFonts w:ascii="Consolas" w:eastAsia="Consolas" w:hAnsi="Consolas"/>
@@ -10903,186 +10524,24 @@
           <w:sz w:val="18"/>
         </w:rPr>
         <w:br/>
-        <w:t xml:space="preserve">    </w:t>
-      </w:r>
-      <w:proofErr w:type="spellStart"/>
-      <w:r>
-        <w:rPr>
-          <w:rFonts w:ascii="Consolas" w:eastAsia="Consolas" w:hAnsi="Consolas"/>
-          <w:color w:val="232323"/>
-          <w:sz w:val="18"/>
-        </w:rPr>
-        <w:t>Result</w:t>
-      </w:r>
-      <w:proofErr w:type="spellEnd"/>
-      <w:r>
-        <w:rPr>
-          <w:rFonts w:ascii="Consolas" w:eastAsia="Consolas" w:hAnsi="Consolas"/>
-          <w:color w:val="232323"/>
-          <w:sz w:val="18"/>
-        </w:rPr>
-        <w:t>&lt;</w:t>
-      </w:r>
-      <w:proofErr w:type="spellStart"/>
-      <w:r>
-        <w:rPr>
-          <w:rFonts w:ascii="Consolas" w:eastAsia="Consolas" w:hAnsi="Consolas"/>
-          <w:color w:val="232323"/>
-          <w:sz w:val="18"/>
-        </w:rPr>
-        <w:t>ZapisNaSajtu</w:t>
-      </w:r>
-      <w:proofErr w:type="spellEnd"/>
-      <w:r>
-        <w:rPr>
-          <w:rFonts w:ascii="Consolas" w:eastAsia="Consolas" w:hAnsi="Consolas"/>
-          <w:color w:val="232323"/>
-          <w:sz w:val="18"/>
-        </w:rPr>
-        <w:t xml:space="preserve">&gt; </w:t>
-      </w:r>
-      <w:proofErr w:type="spellStart"/>
-      <w:r>
-        <w:rPr>
-          <w:rFonts w:ascii="Consolas" w:eastAsia="Consolas" w:hAnsi="Consolas"/>
-          <w:color w:val="232323"/>
-          <w:sz w:val="18"/>
-        </w:rPr>
-        <w:t>Objavi</w:t>
-      </w:r>
-      <w:proofErr w:type="spellEnd"/>
-      <w:r>
-        <w:rPr>
-          <w:rFonts w:ascii="Consolas" w:eastAsia="Consolas" w:hAnsi="Consolas"/>
-          <w:color w:val="232323"/>
-          <w:sz w:val="18"/>
-        </w:rPr>
-        <w:t>(</w:t>
-      </w:r>
-      <w:proofErr w:type="spellStart"/>
-      <w:r>
-        <w:rPr>
-          <w:rFonts w:ascii="Consolas" w:eastAsia="Consolas" w:hAnsi="Consolas"/>
-          <w:color w:val="232323"/>
-          <w:sz w:val="18"/>
-        </w:rPr>
-        <w:t>ZapisNaSajtu</w:t>
-      </w:r>
-      <w:proofErr w:type="spellEnd"/>
-      <w:r>
-        <w:rPr>
-          <w:rFonts w:ascii="Consolas" w:eastAsia="Consolas" w:hAnsi="Consolas"/>
-          <w:color w:val="232323"/>
-          <w:sz w:val="18"/>
-        </w:rPr>
-        <w:t xml:space="preserve"> </w:t>
-      </w:r>
-      <w:proofErr w:type="spellStart"/>
-      <w:r>
-        <w:rPr>
-          <w:rFonts w:ascii="Consolas" w:eastAsia="Consolas" w:hAnsi="Consolas"/>
-          <w:color w:val="232323"/>
-          <w:sz w:val="18"/>
-        </w:rPr>
-        <w:t>zapis</w:t>
-      </w:r>
-      <w:proofErr w:type="spellEnd"/>
-      <w:r>
-        <w:rPr>
-          <w:rFonts w:ascii="Consolas" w:eastAsia="Consolas" w:hAnsi="Consolas"/>
-          <w:color w:val="232323"/>
-          <w:sz w:val="18"/>
-        </w:rPr>
-        <w:t>);</w:t>
-      </w:r>
-      <w:r>
-        <w:rPr>
-          <w:rFonts w:ascii="Consolas" w:eastAsia="Consolas" w:hAnsi="Consolas"/>
-          <w:color w:val="232323"/>
-          <w:sz w:val="18"/>
-        </w:rPr>
-        <w:br/>
-      </w:r>
-      <w:r>
-        <w:rPr>
-          <w:rFonts w:ascii="Consolas" w:eastAsia="Consolas" w:hAnsi="Consolas"/>
-          <w:color w:val="232323"/>
-          <w:sz w:val="18"/>
-        </w:rPr>
-        <w:br/>
-        <w:t xml:space="preserve">    </w:t>
-      </w:r>
-      <w:proofErr w:type="spellStart"/>
-      <w:r>
-        <w:rPr>
-          <w:rFonts w:ascii="Consolas" w:eastAsia="Consolas" w:hAnsi="Consolas"/>
-          <w:color w:val="232323"/>
-          <w:sz w:val="18"/>
-        </w:rPr>
-        <w:t>Result</w:t>
-      </w:r>
-      <w:proofErr w:type="spellEnd"/>
-      <w:r>
-        <w:rPr>
-          <w:rFonts w:ascii="Consolas" w:eastAsia="Consolas" w:hAnsi="Consolas"/>
-          <w:color w:val="232323"/>
-          <w:sz w:val="18"/>
-        </w:rPr>
-        <w:t>&lt;</w:t>
-      </w:r>
-      <w:proofErr w:type="spellStart"/>
-      <w:r>
-        <w:rPr>
-          <w:rFonts w:ascii="Consolas" w:eastAsia="Consolas" w:hAnsi="Consolas"/>
-          <w:color w:val="232323"/>
-          <w:sz w:val="18"/>
-        </w:rPr>
-        <w:t>IReadOnlyList</w:t>
-      </w:r>
-      <w:proofErr w:type="spellEnd"/>
-      <w:r>
-        <w:rPr>
-          <w:rFonts w:ascii="Consolas" w:eastAsia="Consolas" w:hAnsi="Consolas"/>
-          <w:color w:val="232323"/>
-          <w:sz w:val="18"/>
-        </w:rPr>
-        <w:t>&lt;</w:t>
-      </w:r>
-      <w:proofErr w:type="spellStart"/>
-      <w:r>
-        <w:rPr>
-          <w:rFonts w:ascii="Consolas" w:eastAsia="Consolas" w:hAnsi="Consolas"/>
-          <w:color w:val="232323"/>
-          <w:sz w:val="18"/>
-        </w:rPr>
-        <w:t>ZapisNaSajtu</w:t>
-      </w:r>
-      <w:proofErr w:type="spellEnd"/>
-      <w:r>
-        <w:rPr>
-          <w:rFonts w:ascii="Consolas" w:eastAsia="Consolas" w:hAnsi="Consolas"/>
-          <w:color w:val="232323"/>
-          <w:sz w:val="18"/>
-        </w:rPr>
-        <w:t xml:space="preserve">&gt;&gt; </w:t>
-      </w:r>
-      <w:proofErr w:type="spellStart"/>
-      <w:r>
-        <w:rPr>
-          <w:rFonts w:ascii="Consolas" w:eastAsia="Consolas" w:hAnsi="Consolas"/>
-          <w:color w:val="232323"/>
-          <w:sz w:val="18"/>
-        </w:rPr>
-        <w:t>PregledZapisa</w:t>
-      </w:r>
-      <w:proofErr w:type="spellEnd"/>
-      <w:r>
-        <w:rPr>
-          <w:rFonts w:ascii="Consolas" w:eastAsia="Consolas" w:hAnsi="Consolas"/>
-          <w:color w:val="232323"/>
-          <w:sz w:val="18"/>
-        </w:rPr>
-        <w:t>();</w:t>
+        <w:t xml:space="preserve">    Result&lt;ZapisNaSajtu&gt; Objavi(ZapisNaSajtu zapis);</w:t>
+      </w:r>
+      <w:r>
+        <w:rPr>
+          <w:rFonts w:ascii="Consolas" w:eastAsia="Consolas" w:hAnsi="Consolas"/>
+          <w:color w:val="232323"/>
+          <w:sz w:val="18"/>
+        </w:rPr>
+        <w:br/>
+      </w:r>
+      <w:r>
+        <w:rPr>
+          <w:rFonts w:ascii="Consolas" w:eastAsia="Consolas" w:hAnsi="Consolas"/>
+          <w:color w:val="232323"/>
+          <w:sz w:val="18"/>
+        </w:rPr>
+        <w:br/>
+        <w:t xml:space="preserve">    Result&lt;IReadOnlyList&lt;ZapisNaSajtu&gt;&gt; PregledZapisa();</w:t>
       </w:r>
       <w:r>
         <w:rPr>
@@ -11109,7 +10568,6 @@
         </w:rPr>
         <w:br/>
       </w:r>
-      <w:proofErr w:type="spellStart"/>
       <w:r>
         <w:rPr>
           <w:rFonts w:ascii="Consolas" w:eastAsia="Consolas" w:hAnsi="Consolas"/>
@@ -11119,7 +10577,6 @@
         </w:rPr>
         <w:t>public</w:t>
       </w:r>
-      <w:proofErr w:type="spellEnd"/>
       <w:r>
         <w:rPr>
           <w:rFonts w:ascii="Consolas" w:eastAsia="Consolas" w:hAnsi="Consolas"/>
@@ -11128,7 +10585,6 @@
         </w:rPr>
         <w:t xml:space="preserve"> </w:t>
       </w:r>
-      <w:proofErr w:type="spellStart"/>
       <w:r>
         <w:rPr>
           <w:rFonts w:ascii="Consolas" w:eastAsia="Consolas" w:hAnsi="Consolas"/>
@@ -11138,25 +10594,14 @@
         </w:rPr>
         <w:t>interface</w:t>
       </w:r>
-      <w:proofErr w:type="spellEnd"/>
-      <w:r>
-        <w:rPr>
-          <w:rFonts w:ascii="Consolas" w:eastAsia="Consolas" w:hAnsi="Consolas"/>
-          <w:color w:val="232323"/>
-          <w:sz w:val="18"/>
-        </w:rPr>
-        <w:t xml:space="preserve"> </w:t>
-      </w:r>
-      <w:proofErr w:type="spellStart"/>
-      <w:r>
-        <w:rPr>
-          <w:rFonts w:ascii="Consolas" w:eastAsia="Consolas" w:hAnsi="Consolas"/>
-          <w:color w:val="232323"/>
-          <w:sz w:val="18"/>
-        </w:rPr>
-        <w:t>IBazaPodataka</w:t>
-      </w:r>
-      <w:proofErr w:type="spellEnd"/>
+      <w:r>
+        <w:rPr>
+          <w:rFonts w:ascii="Consolas" w:eastAsia="Consolas" w:hAnsi="Consolas"/>
+          <w:color w:val="232323"/>
+          <w:sz w:val="18"/>
+        </w:rPr>
+        <w:t xml:space="preserve"> IBazaPodataka</w:t>
+      </w:r>
       <w:r>
         <w:rPr>
           <w:rFonts w:ascii="Consolas" w:eastAsia="Consolas" w:hAnsi="Consolas"/>
@@ -11173,45 +10618,8 @@
           <w:sz w:val="18"/>
         </w:rPr>
         <w:br/>
-        <w:t xml:space="preserve">    </w:t>
-      </w:r>
-      <w:proofErr w:type="spellStart"/>
-      <w:r>
-        <w:rPr>
-          <w:rFonts w:ascii="Consolas" w:eastAsia="Consolas" w:hAnsi="Consolas"/>
-          <w:color w:val="232323"/>
-          <w:sz w:val="18"/>
-        </w:rPr>
-        <w:t>TabeleBazaPodataka</w:t>
-      </w:r>
-      <w:proofErr w:type="spellEnd"/>
-      <w:r>
-        <w:rPr>
-          <w:rFonts w:ascii="Consolas" w:eastAsia="Consolas" w:hAnsi="Consolas"/>
-          <w:color w:val="232323"/>
-          <w:sz w:val="18"/>
-        </w:rPr>
-        <w:t xml:space="preserve"> </w:t>
-      </w:r>
-      <w:proofErr w:type="spellStart"/>
-      <w:r>
-        <w:rPr>
-          <w:rFonts w:ascii="Consolas" w:eastAsia="Consolas" w:hAnsi="Consolas"/>
-          <w:color w:val="232323"/>
-          <w:sz w:val="18"/>
-        </w:rPr>
-        <w:t>Tabele</w:t>
-      </w:r>
-      <w:proofErr w:type="spellEnd"/>
-      <w:r>
-        <w:rPr>
-          <w:rFonts w:ascii="Consolas" w:eastAsia="Consolas" w:hAnsi="Consolas"/>
-          <w:color w:val="232323"/>
-          <w:sz w:val="18"/>
-        </w:rPr>
-        <w:t xml:space="preserve"> { </w:t>
-      </w:r>
-      <w:proofErr w:type="spellStart"/>
+        <w:t xml:space="preserve">    TabeleBazaPodataka Tabele { </w:t>
+      </w:r>
       <w:r>
         <w:rPr>
           <w:rFonts w:ascii="Consolas" w:eastAsia="Consolas" w:hAnsi="Consolas"/>
@@ -11221,7 +10629,6 @@
         </w:rPr>
         <w:t>get</w:t>
       </w:r>
-      <w:proofErr w:type="spellEnd"/>
       <w:r>
         <w:rPr>
           <w:rFonts w:ascii="Consolas" w:eastAsia="Consolas" w:hAnsi="Consolas"/>
@@ -11239,7 +10646,6 @@
         <w:br/>
         <w:t xml:space="preserve">    </w:t>
       </w:r>
-      <w:proofErr w:type="spellStart"/>
       <w:r>
         <w:rPr>
           <w:rFonts w:ascii="Consolas" w:eastAsia="Consolas" w:hAnsi="Consolas"/>
@@ -11249,34 +10655,14 @@
         </w:rPr>
         <w:t>bool</w:t>
       </w:r>
-      <w:proofErr w:type="spellEnd"/>
-      <w:r>
-        <w:rPr>
-          <w:rFonts w:ascii="Consolas" w:eastAsia="Consolas" w:hAnsi="Consolas"/>
-          <w:color w:val="232323"/>
-          <w:sz w:val="18"/>
-        </w:rPr>
-        <w:t xml:space="preserve"> </w:t>
-      </w:r>
-      <w:proofErr w:type="spellStart"/>
-      <w:r>
-        <w:rPr>
-          <w:rFonts w:ascii="Consolas" w:eastAsia="Consolas" w:hAnsi="Consolas"/>
-          <w:color w:val="232323"/>
-          <w:sz w:val="18"/>
-        </w:rPr>
-        <w:t>IsReady</w:t>
-      </w:r>
-      <w:proofErr w:type="spellEnd"/>
-      <w:r>
-        <w:rPr>
-          <w:rFonts w:ascii="Consolas" w:eastAsia="Consolas" w:hAnsi="Consolas"/>
-          <w:color w:val="232323"/>
-          <w:sz w:val="18"/>
-        </w:rPr>
-        <w:t xml:space="preserve"> { </w:t>
-      </w:r>
-      <w:proofErr w:type="spellStart"/>
+      <w:r>
+        <w:rPr>
+          <w:rFonts w:ascii="Consolas" w:eastAsia="Consolas" w:hAnsi="Consolas"/>
+          <w:color w:val="232323"/>
+          <w:sz w:val="18"/>
+        </w:rPr>
+        <w:t xml:space="preserve"> IsReady { </w:t>
+      </w:r>
       <w:r>
         <w:rPr>
           <w:rFonts w:ascii="Consolas" w:eastAsia="Consolas" w:hAnsi="Consolas"/>
@@ -11286,7 +10672,6 @@
         </w:rPr>
         <w:t>get</w:t>
       </w:r>
-      <w:proofErr w:type="spellEnd"/>
       <w:r>
         <w:rPr>
           <w:rFonts w:ascii="Consolas" w:eastAsia="Consolas" w:hAnsi="Consolas"/>
@@ -11304,7 +10689,6 @@
         <w:br/>
         <w:t xml:space="preserve">    </w:t>
       </w:r>
-      <w:proofErr w:type="spellStart"/>
       <w:r>
         <w:rPr>
           <w:rFonts w:ascii="Consolas" w:eastAsia="Consolas" w:hAnsi="Consolas"/>
@@ -11314,7 +10698,6 @@
         </w:rPr>
         <w:t>bool</w:t>
       </w:r>
-      <w:proofErr w:type="spellEnd"/>
       <w:r>
         <w:rPr>
           <w:rFonts w:ascii="Consolas" w:eastAsia="Consolas" w:hAnsi="Consolas"/>
@@ -11323,7 +10706,6 @@
         </w:rPr>
         <w:t xml:space="preserve"> </w:t>
       </w:r>
-      <w:proofErr w:type="spellStart"/>
       <w:r>
         <w:rPr>
           <w:rFonts w:ascii="Consolas" w:eastAsia="Consolas" w:hAnsi="Consolas"/>
@@ -11332,7 +10714,6 @@
         </w:rPr>
         <w:t>SacuvajPromene</w:t>
       </w:r>
-      <w:proofErr w:type="spellEnd"/>
       <w:r>
         <w:rPr>
           <w:rFonts w:ascii="Consolas" w:eastAsia="Consolas" w:hAnsi="Consolas"/>
@@ -11361,113 +10742,8 @@
           <w:color w:val="171717"/>
           <w:sz w:val="20"/>
         </w:rPr>
-        <w:t xml:space="preserve">Листинг 2.6.1. </w:t>
-      </w:r>
-      <w:proofErr w:type="spellStart"/>
-      <w:r>
-        <w:rPr>
-          <w:color w:val="171717"/>
-          <w:sz w:val="20"/>
-        </w:rPr>
-        <w:t>Application</w:t>
-      </w:r>
-      <w:proofErr w:type="spellEnd"/>
-      <w:r>
-        <w:rPr>
-          <w:color w:val="171717"/>
-          <w:sz w:val="20"/>
-        </w:rPr>
-        <w:t>/</w:t>
-      </w:r>
-      <w:proofErr w:type="spellStart"/>
-      <w:r>
-        <w:rPr>
-          <w:color w:val="171717"/>
-          <w:sz w:val="20"/>
-        </w:rPr>
-        <w:t>Interfaces</w:t>
-      </w:r>
-      <w:proofErr w:type="spellEnd"/>
-      <w:r>
-        <w:rPr>
-          <w:color w:val="171717"/>
-          <w:sz w:val="20"/>
-        </w:rPr>
-        <w:t>/</w:t>
-      </w:r>
-      <w:proofErr w:type="spellStart"/>
-      <w:r>
-        <w:rPr>
-          <w:color w:val="171717"/>
-          <w:sz w:val="20"/>
-        </w:rPr>
-        <w:t>Services</w:t>
-      </w:r>
-      <w:proofErr w:type="spellEnd"/>
-      <w:r>
-        <w:rPr>
-          <w:color w:val="171717"/>
-          <w:sz w:val="20"/>
-        </w:rPr>
-        <w:t>/</w:t>
-      </w:r>
-      <w:proofErr w:type="spellStart"/>
-      <w:r>
-        <w:rPr>
-          <w:color w:val="171717"/>
-          <w:sz w:val="20"/>
-        </w:rPr>
-        <w:t>IZapisiServis.cs</w:t>
-      </w:r>
-      <w:proofErr w:type="spellEnd"/>
-      <w:r>
-        <w:rPr>
-          <w:color w:val="171717"/>
-          <w:sz w:val="20"/>
-        </w:rPr>
-        <w:t xml:space="preserve"> и </w:t>
-      </w:r>
-      <w:proofErr w:type="spellStart"/>
-      <w:r>
-        <w:rPr>
-          <w:color w:val="171717"/>
-          <w:sz w:val="20"/>
-        </w:rPr>
-        <w:t>Database</w:t>
-      </w:r>
-      <w:proofErr w:type="spellEnd"/>
-      <w:r>
-        <w:rPr>
-          <w:color w:val="171717"/>
-          <w:sz w:val="20"/>
-        </w:rPr>
-        <w:t>/</w:t>
-      </w:r>
-      <w:proofErr w:type="spellStart"/>
-      <w:r>
-        <w:rPr>
-          <w:color w:val="171717"/>
-          <w:sz w:val="20"/>
-        </w:rPr>
-        <w:t>Interfaces</w:t>
-      </w:r>
-      <w:proofErr w:type="spellEnd"/>
-      <w:r>
-        <w:rPr>
-          <w:color w:val="171717"/>
-          <w:sz w:val="20"/>
-        </w:rPr>
-        <w:t>/</w:t>
-      </w:r>
-      <w:proofErr w:type="spellStart"/>
-      <w:r>
-        <w:rPr>
-          <w:color w:val="171717"/>
-          <w:sz w:val="20"/>
-        </w:rPr>
-        <w:t>IBazaPodataka.cs</w:t>
-      </w:r>
-      <w:proofErr w:type="spellEnd"/>
+        <w:t>Листинг 2.6.1. Application/Interfaces/Services/IZapisiServis.cs и Database/Interfaces/IBazaPodataka.cs</w:t>
+      </w:r>
     </w:p>
     <w:p>
       <w:pPr>
@@ -12607,7 +11883,7 @@
                     <pic:cNvPicPr/>
                   </pic:nvPicPr>
                   <pic:blipFill>
-                    <a:blip r:embed="rId20"/>
+                    <a:blip r:embed="rId22"/>
                     <a:stretch>
                       <a:fillRect/>
                     </a:stretch>
@@ -15857,7 +15133,7 @@
                     <pic:cNvPicPr/>
                   </pic:nvPicPr>
                   <pic:blipFill>
-                    <a:blip r:embed="rId21"/>
+                    <a:blip r:embed="rId23"/>
                     <a:stretch>
                       <a:fillRect/>
                     </a:stretch>
@@ -16458,7 +15734,7 @@
                     <pic:cNvPicPr/>
                   </pic:nvPicPr>
                   <pic:blipFill rotWithShape="1">
-                    <a:blip r:embed="rId22"/>
+                    <a:blip r:embed="rId24"/>
                     <a:srcRect t="31634" b="30663"/>
                     <a:stretch>
                       <a:fillRect/>
@@ -16522,35 +15798,16 @@
           <w:color w:val="232323"/>
           <w:sz w:val="18"/>
         </w:rPr>
-        <w:t>[</w:t>
-      </w:r>
-      <w:proofErr w:type="spellStart"/>
-      <w:r>
-        <w:rPr>
-          <w:rFonts w:ascii="Consolas" w:eastAsia="Consolas" w:hAnsi="Consolas"/>
-          <w:color w:val="232323"/>
-          <w:sz w:val="18"/>
-        </w:rPr>
-        <w:t>Test</w:t>
-      </w:r>
-      <w:proofErr w:type="spellEnd"/>
-      <w:r>
-        <w:rPr>
-          <w:rFonts w:ascii="Consolas" w:eastAsia="Consolas" w:hAnsi="Consolas"/>
-          <w:color w:val="232323"/>
-          <w:sz w:val="18"/>
-        </w:rPr>
-        <w:t>]</w:t>
-      </w:r>
-      <w:r>
-        <w:rPr>
-          <w:rFonts w:ascii="Consolas" w:eastAsia="Consolas" w:hAnsi="Consolas"/>
-          <w:color w:val="232323"/>
-          <w:sz w:val="18"/>
-        </w:rPr>
-        <w:br/>
-      </w:r>
-      <w:proofErr w:type="spellStart"/>
+        <w:t>[Test]</w:t>
+      </w:r>
+      <w:r>
+        <w:rPr>
+          <w:rFonts w:ascii="Consolas" w:eastAsia="Consolas" w:hAnsi="Consolas"/>
+          <w:color w:val="232323"/>
+          <w:sz w:val="18"/>
+        </w:rPr>
+        <w:br/>
+      </w:r>
       <w:r>
         <w:rPr>
           <w:rFonts w:ascii="Consolas" w:eastAsia="Consolas" w:hAnsi="Consolas"/>
@@ -16560,7 +15817,6 @@
         </w:rPr>
         <w:t>public</w:t>
       </w:r>
-      <w:proofErr w:type="spellEnd"/>
       <w:r>
         <w:rPr>
           <w:rFonts w:ascii="Consolas" w:eastAsia="Consolas" w:hAnsi="Consolas"/>
@@ -16569,7 +15825,6 @@
         </w:rPr>
         <w:t xml:space="preserve"> </w:t>
       </w:r>
-      <w:proofErr w:type="spellStart"/>
       <w:r>
         <w:rPr>
           <w:rFonts w:ascii="Consolas" w:eastAsia="Consolas" w:hAnsi="Consolas"/>
@@ -16579,7 +15834,6 @@
         </w:rPr>
         <w:t>void</w:t>
       </w:r>
-      <w:proofErr w:type="spellEnd"/>
       <w:r>
         <w:rPr>
           <w:rFonts w:ascii="Consolas" w:eastAsia="Consolas" w:hAnsi="Consolas"/>
@@ -16588,7 +15842,6 @@
         </w:rPr>
         <w:t xml:space="preserve"> </w:t>
       </w:r>
-      <w:proofErr w:type="spellStart"/>
       <w:r>
         <w:rPr>
           <w:rFonts w:ascii="Consolas" w:eastAsia="Consolas" w:hAnsi="Consolas"/>
@@ -16597,7 +15850,6 @@
         </w:rPr>
         <w:t>Reserve_WhenPeriodOverlaps_ReturnsConflict</w:t>
       </w:r>
-      <w:proofErr w:type="spellEnd"/>
       <w:r>
         <w:rPr>
           <w:rFonts w:ascii="Consolas" w:eastAsia="Consolas" w:hAnsi="Consolas"/>
@@ -16630,24 +15882,14 @@
           <w:color w:val="46815E"/>
           <w:sz w:val="18"/>
         </w:rPr>
-        <w:t xml:space="preserve">// </w:t>
-      </w:r>
-      <w:proofErr w:type="spellStart"/>
+        <w:t>// Arrange</w:t>
+      </w:r>
       <w:r>
         <w:rPr>
           <w:rFonts w:ascii="Consolas" w:eastAsia="Consolas" w:hAnsi="Consolas"/>
           <w:color w:val="46815E"/>
           <w:sz w:val="18"/>
         </w:rPr>
-        <w:t>Arrange</w:t>
-      </w:r>
-      <w:proofErr w:type="spellEnd"/>
-      <w:r>
-        <w:rPr>
-          <w:rFonts w:ascii="Consolas" w:eastAsia="Consolas" w:hAnsi="Consolas"/>
-          <w:color w:val="46815E"/>
-          <w:sz w:val="18"/>
-        </w:rPr>
         <w:br/>
       </w:r>
       <w:r>
@@ -16658,7 +15900,6 @@
         </w:rPr>
         <w:t xml:space="preserve">    </w:t>
       </w:r>
-      <w:proofErr w:type="spellStart"/>
       <w:r>
         <w:rPr>
           <w:rFonts w:ascii="Consolas" w:eastAsia="Consolas" w:hAnsi="Consolas"/>
@@ -16668,34 +15909,14 @@
         </w:rPr>
         <w:t>var</w:t>
       </w:r>
-      <w:proofErr w:type="spellEnd"/>
-      <w:r>
-        <w:rPr>
-          <w:rFonts w:ascii="Consolas" w:eastAsia="Consolas" w:hAnsi="Consolas"/>
-          <w:color w:val="232323"/>
-          <w:sz w:val="18"/>
-        </w:rPr>
-        <w:t xml:space="preserve"> </w:t>
-      </w:r>
-      <w:proofErr w:type="spellStart"/>
-      <w:r>
-        <w:rPr>
-          <w:rFonts w:ascii="Consolas" w:eastAsia="Consolas" w:hAnsi="Consolas"/>
-          <w:color w:val="232323"/>
-          <w:sz w:val="18"/>
-        </w:rPr>
-        <w:t>repository</w:t>
-      </w:r>
-      <w:proofErr w:type="spellEnd"/>
-      <w:r>
-        <w:rPr>
-          <w:rFonts w:ascii="Consolas" w:eastAsia="Consolas" w:hAnsi="Consolas"/>
-          <w:color w:val="232323"/>
-          <w:sz w:val="18"/>
-        </w:rPr>
-        <w:t xml:space="preserve"> = </w:t>
-      </w:r>
-      <w:proofErr w:type="spellStart"/>
+      <w:r>
+        <w:rPr>
+          <w:rFonts w:ascii="Consolas" w:eastAsia="Consolas" w:hAnsi="Consolas"/>
+          <w:color w:val="232323"/>
+          <w:sz w:val="18"/>
+        </w:rPr>
+        <w:t xml:space="preserve"> repository = </w:t>
+      </w:r>
       <w:r>
         <w:rPr>
           <w:rFonts w:ascii="Consolas" w:eastAsia="Consolas" w:hAnsi="Consolas"/>
@@ -16705,278 +15926,68 @@
         </w:rPr>
         <w:t>new</w:t>
       </w:r>
-      <w:proofErr w:type="spellEnd"/>
-      <w:r>
-        <w:rPr>
-          <w:rFonts w:ascii="Consolas" w:eastAsia="Consolas" w:hAnsi="Consolas"/>
-          <w:color w:val="232323"/>
-          <w:sz w:val="18"/>
-        </w:rPr>
-        <w:t xml:space="preserve"> </w:t>
-      </w:r>
-      <w:proofErr w:type="spellStart"/>
-      <w:r>
-        <w:rPr>
-          <w:rFonts w:ascii="Consolas" w:eastAsia="Consolas" w:hAnsi="Consolas"/>
-          <w:color w:val="232323"/>
-          <w:sz w:val="18"/>
-        </w:rPr>
-        <w:t>Mock</w:t>
-      </w:r>
-      <w:proofErr w:type="spellEnd"/>
-      <w:r>
-        <w:rPr>
-          <w:rFonts w:ascii="Consolas" w:eastAsia="Consolas" w:hAnsi="Consolas"/>
-          <w:color w:val="232323"/>
-          <w:sz w:val="18"/>
-        </w:rPr>
-        <w:t>&lt;</w:t>
-      </w:r>
-      <w:proofErr w:type="spellStart"/>
-      <w:r>
-        <w:rPr>
-          <w:rFonts w:ascii="Consolas" w:eastAsia="Consolas" w:hAnsi="Consolas"/>
-          <w:color w:val="232323"/>
-          <w:sz w:val="18"/>
-        </w:rPr>
-        <w:t>IReservationRepository</w:t>
-      </w:r>
-      <w:proofErr w:type="spellEnd"/>
-      <w:r>
-        <w:rPr>
-          <w:rFonts w:ascii="Consolas" w:eastAsia="Consolas" w:hAnsi="Consolas"/>
-          <w:color w:val="232323"/>
-          <w:sz w:val="18"/>
-        </w:rPr>
-        <w:t>&gt;();</w:t>
-      </w:r>
-      <w:r>
-        <w:rPr>
-          <w:rFonts w:ascii="Consolas" w:eastAsia="Consolas" w:hAnsi="Consolas"/>
-          <w:color w:val="232323"/>
-          <w:sz w:val="18"/>
-        </w:rPr>
-        <w:br/>
-        <w:t xml:space="preserve">    </w:t>
-      </w:r>
-      <w:proofErr w:type="spellStart"/>
-      <w:r>
-        <w:rPr>
-          <w:rFonts w:ascii="Consolas" w:eastAsia="Consolas" w:hAnsi="Consolas"/>
-          <w:color w:val="232323"/>
-          <w:sz w:val="18"/>
-        </w:rPr>
-        <w:t>repository</w:t>
-      </w:r>
-      <w:proofErr w:type="spellEnd"/>
-      <w:r>
-        <w:rPr>
-          <w:rFonts w:ascii="Consolas" w:eastAsia="Consolas" w:hAnsi="Consolas"/>
-          <w:color w:val="232323"/>
-          <w:sz w:val="18"/>
-        </w:rPr>
-        <w:br/>
-        <w:t xml:space="preserve">        .</w:t>
-      </w:r>
-      <w:proofErr w:type="spellStart"/>
-      <w:r>
-        <w:rPr>
-          <w:rFonts w:ascii="Consolas" w:eastAsia="Consolas" w:hAnsi="Consolas"/>
-          <w:color w:val="232323"/>
-          <w:sz w:val="18"/>
-        </w:rPr>
-        <w:t>Setup</w:t>
-      </w:r>
-      <w:proofErr w:type="spellEnd"/>
-      <w:r>
-        <w:rPr>
-          <w:rFonts w:ascii="Consolas" w:eastAsia="Consolas" w:hAnsi="Consolas"/>
-          <w:color w:val="232323"/>
-          <w:sz w:val="18"/>
-        </w:rPr>
-        <w:t xml:space="preserve">(r =&gt; </w:t>
-      </w:r>
-      <w:proofErr w:type="spellStart"/>
-      <w:r>
-        <w:rPr>
-          <w:rFonts w:ascii="Consolas" w:eastAsia="Consolas" w:hAnsi="Consolas"/>
-          <w:color w:val="232323"/>
-          <w:sz w:val="18"/>
-        </w:rPr>
-        <w:t>r.HasOverlap</w:t>
-      </w:r>
-      <w:proofErr w:type="spellEnd"/>
-      <w:r>
-        <w:rPr>
-          <w:rFonts w:ascii="Consolas" w:eastAsia="Consolas" w:hAnsi="Consolas"/>
-          <w:color w:val="232323"/>
-          <w:sz w:val="18"/>
-        </w:rPr>
-        <w:t>(</w:t>
-      </w:r>
-      <w:r>
-        <w:rPr>
-          <w:rFonts w:ascii="Consolas" w:eastAsia="Consolas" w:hAnsi="Consolas"/>
-          <w:color w:val="232323"/>
-          <w:sz w:val="18"/>
-        </w:rPr>
-        <w:br/>
-        <w:t xml:space="preserve">            </w:t>
-      </w:r>
-      <w:proofErr w:type="spellStart"/>
-      <w:r>
-        <w:rPr>
-          <w:rFonts w:ascii="Consolas" w:eastAsia="Consolas" w:hAnsi="Consolas"/>
-          <w:color w:val="232323"/>
-          <w:sz w:val="18"/>
-        </w:rPr>
-        <w:t>It.IsAny</w:t>
-      </w:r>
-      <w:proofErr w:type="spellEnd"/>
-      <w:r>
-        <w:rPr>
-          <w:rFonts w:ascii="Consolas" w:eastAsia="Consolas" w:hAnsi="Consolas"/>
-          <w:color w:val="232323"/>
-          <w:sz w:val="18"/>
-        </w:rPr>
-        <w:t>&lt;</w:t>
-      </w:r>
-      <w:proofErr w:type="spellStart"/>
-      <w:r>
-        <w:rPr>
-          <w:rFonts w:ascii="Consolas" w:eastAsia="Consolas" w:hAnsi="Consolas"/>
-          <w:color w:val="232323"/>
-          <w:sz w:val="18"/>
-        </w:rPr>
-        <w:t>Guid</w:t>
-      </w:r>
-      <w:proofErr w:type="spellEnd"/>
-      <w:r>
-        <w:rPr>
-          <w:rFonts w:ascii="Consolas" w:eastAsia="Consolas" w:hAnsi="Consolas"/>
-          <w:color w:val="232323"/>
-          <w:sz w:val="18"/>
-        </w:rPr>
-        <w:t>&gt;(),</w:t>
-      </w:r>
-      <w:r>
-        <w:rPr>
-          <w:rFonts w:ascii="Consolas" w:eastAsia="Consolas" w:hAnsi="Consolas"/>
-          <w:color w:val="232323"/>
-          <w:sz w:val="18"/>
-        </w:rPr>
-        <w:br/>
-        <w:t xml:space="preserve">            </w:t>
-      </w:r>
-      <w:proofErr w:type="spellStart"/>
-      <w:r>
-        <w:rPr>
-          <w:rFonts w:ascii="Consolas" w:eastAsia="Consolas" w:hAnsi="Consolas"/>
-          <w:color w:val="232323"/>
-          <w:sz w:val="18"/>
-        </w:rPr>
-        <w:t>It.IsAny</w:t>
-      </w:r>
-      <w:proofErr w:type="spellEnd"/>
-      <w:r>
-        <w:rPr>
-          <w:rFonts w:ascii="Consolas" w:eastAsia="Consolas" w:hAnsi="Consolas"/>
-          <w:color w:val="232323"/>
-          <w:sz w:val="18"/>
-        </w:rPr>
-        <w:t>&lt;</w:t>
-      </w:r>
-      <w:proofErr w:type="spellStart"/>
-      <w:r>
-        <w:rPr>
-          <w:rFonts w:ascii="Consolas" w:eastAsia="Consolas" w:hAnsi="Consolas"/>
-          <w:color w:val="232323"/>
-          <w:sz w:val="18"/>
-        </w:rPr>
-        <w:t>DateTime</w:t>
-      </w:r>
-      <w:proofErr w:type="spellEnd"/>
-      <w:r>
-        <w:rPr>
-          <w:rFonts w:ascii="Consolas" w:eastAsia="Consolas" w:hAnsi="Consolas"/>
-          <w:color w:val="232323"/>
-          <w:sz w:val="18"/>
-        </w:rPr>
-        <w:t>&gt;(),</w:t>
-      </w:r>
-      <w:r>
-        <w:rPr>
-          <w:rFonts w:ascii="Consolas" w:eastAsia="Consolas" w:hAnsi="Consolas"/>
-          <w:color w:val="232323"/>
-          <w:sz w:val="18"/>
-        </w:rPr>
-        <w:br/>
-        <w:t xml:space="preserve">            </w:t>
-      </w:r>
-      <w:proofErr w:type="spellStart"/>
-      <w:r>
-        <w:rPr>
-          <w:rFonts w:ascii="Consolas" w:eastAsia="Consolas" w:hAnsi="Consolas"/>
-          <w:color w:val="232323"/>
-          <w:sz w:val="18"/>
-        </w:rPr>
-        <w:t>It.IsAny</w:t>
-      </w:r>
-      <w:proofErr w:type="spellEnd"/>
-      <w:r>
-        <w:rPr>
-          <w:rFonts w:ascii="Consolas" w:eastAsia="Consolas" w:hAnsi="Consolas"/>
-          <w:color w:val="232323"/>
-          <w:sz w:val="18"/>
-        </w:rPr>
-        <w:t>&lt;</w:t>
-      </w:r>
-      <w:proofErr w:type="spellStart"/>
-      <w:r>
-        <w:rPr>
-          <w:rFonts w:ascii="Consolas" w:eastAsia="Consolas" w:hAnsi="Consolas"/>
-          <w:color w:val="232323"/>
-          <w:sz w:val="18"/>
-        </w:rPr>
-        <w:t>DateTime</w:t>
-      </w:r>
-      <w:proofErr w:type="spellEnd"/>
-      <w:r>
-        <w:rPr>
-          <w:rFonts w:ascii="Consolas" w:eastAsia="Consolas" w:hAnsi="Consolas"/>
-          <w:color w:val="232323"/>
-          <w:sz w:val="18"/>
-        </w:rPr>
-        <w:t>&gt;()))</w:t>
-      </w:r>
-      <w:r>
-        <w:rPr>
-          <w:rFonts w:ascii="Consolas" w:eastAsia="Consolas" w:hAnsi="Consolas"/>
-          <w:color w:val="232323"/>
-          <w:sz w:val="18"/>
-        </w:rPr>
-        <w:br/>
-        <w:t xml:space="preserve">        .</w:t>
-      </w:r>
-      <w:proofErr w:type="spellStart"/>
-      <w:r>
-        <w:rPr>
-          <w:rFonts w:ascii="Consolas" w:eastAsia="Consolas" w:hAnsi="Consolas"/>
-          <w:color w:val="232323"/>
-          <w:sz w:val="18"/>
-        </w:rPr>
-        <w:t>Returns</w:t>
-      </w:r>
-      <w:proofErr w:type="spellEnd"/>
-      <w:r>
-        <w:rPr>
-          <w:rFonts w:ascii="Consolas" w:eastAsia="Consolas" w:hAnsi="Consolas"/>
-          <w:color w:val="232323"/>
-          <w:sz w:val="18"/>
-        </w:rPr>
-        <w:t>(</w:t>
-      </w:r>
-      <w:proofErr w:type="spellStart"/>
+      <w:r>
+        <w:rPr>
+          <w:rFonts w:ascii="Consolas" w:eastAsia="Consolas" w:hAnsi="Consolas"/>
+          <w:color w:val="232323"/>
+          <w:sz w:val="18"/>
+        </w:rPr>
+        <w:t xml:space="preserve"> Mock&lt;IReservationRepository&gt;();</w:t>
+      </w:r>
+      <w:r>
+        <w:rPr>
+          <w:rFonts w:ascii="Consolas" w:eastAsia="Consolas" w:hAnsi="Consolas"/>
+          <w:color w:val="232323"/>
+          <w:sz w:val="18"/>
+        </w:rPr>
+        <w:br/>
+        <w:t xml:space="preserve">    repository</w:t>
+      </w:r>
+      <w:r>
+        <w:rPr>
+          <w:rFonts w:ascii="Consolas" w:eastAsia="Consolas" w:hAnsi="Consolas"/>
+          <w:color w:val="232323"/>
+          <w:sz w:val="18"/>
+        </w:rPr>
+        <w:br/>
+        <w:t xml:space="preserve">        .Setup(r =&gt; r.HasOverlap(</w:t>
+      </w:r>
+      <w:r>
+        <w:rPr>
+          <w:rFonts w:ascii="Consolas" w:eastAsia="Consolas" w:hAnsi="Consolas"/>
+          <w:color w:val="232323"/>
+          <w:sz w:val="18"/>
+        </w:rPr>
+        <w:br/>
+        <w:t xml:space="preserve">            It.IsAny&lt;Guid&gt;(),</w:t>
+      </w:r>
+      <w:r>
+        <w:rPr>
+          <w:rFonts w:ascii="Consolas" w:eastAsia="Consolas" w:hAnsi="Consolas"/>
+          <w:color w:val="232323"/>
+          <w:sz w:val="18"/>
+        </w:rPr>
+        <w:br/>
+        <w:t xml:space="preserve">            It.IsAny&lt;DateTime&gt;(),</w:t>
+      </w:r>
+      <w:r>
+        <w:rPr>
+          <w:rFonts w:ascii="Consolas" w:eastAsia="Consolas" w:hAnsi="Consolas"/>
+          <w:color w:val="232323"/>
+          <w:sz w:val="18"/>
+        </w:rPr>
+        <w:br/>
+        <w:t xml:space="preserve">            It.IsAny&lt;DateTime&gt;()))</w:t>
+      </w:r>
+      <w:r>
+        <w:rPr>
+          <w:rFonts w:ascii="Consolas" w:eastAsia="Consolas" w:hAnsi="Consolas"/>
+          <w:color w:val="232323"/>
+          <w:sz w:val="18"/>
+        </w:rPr>
+        <w:br/>
+        <w:t xml:space="preserve">        .Returns(</w:t>
+      </w:r>
       <w:r>
         <w:rPr>
           <w:rFonts w:ascii="Consolas" w:eastAsia="Consolas" w:hAnsi="Consolas"/>
@@ -16986,7 +15997,6 @@
         </w:rPr>
         <w:t>true</w:t>
       </w:r>
-      <w:proofErr w:type="spellEnd"/>
       <w:r>
         <w:rPr>
           <w:rFonts w:ascii="Consolas" w:eastAsia="Consolas" w:hAnsi="Consolas"/>
@@ -17012,7 +16022,6 @@
         <w:br/>
         <w:t xml:space="preserve">    </w:t>
       </w:r>
-      <w:proofErr w:type="spellStart"/>
       <w:r>
         <w:rPr>
           <w:rFonts w:ascii="Consolas" w:eastAsia="Consolas" w:hAnsi="Consolas"/>
@@ -17022,34 +16031,14 @@
         </w:rPr>
         <w:t>var</w:t>
       </w:r>
-      <w:proofErr w:type="spellEnd"/>
-      <w:r>
-        <w:rPr>
-          <w:rFonts w:ascii="Consolas" w:eastAsia="Consolas" w:hAnsi="Consolas"/>
-          <w:color w:val="232323"/>
-          <w:sz w:val="18"/>
-        </w:rPr>
-        <w:t xml:space="preserve"> </w:t>
-      </w:r>
-      <w:proofErr w:type="spellStart"/>
-      <w:r>
-        <w:rPr>
-          <w:rFonts w:ascii="Consolas" w:eastAsia="Consolas" w:hAnsi="Consolas"/>
-          <w:color w:val="232323"/>
-          <w:sz w:val="18"/>
-        </w:rPr>
-        <w:t>clock</w:t>
-      </w:r>
-      <w:proofErr w:type="spellEnd"/>
-      <w:r>
-        <w:rPr>
-          <w:rFonts w:ascii="Consolas" w:eastAsia="Consolas" w:hAnsi="Consolas"/>
-          <w:color w:val="232323"/>
-          <w:sz w:val="18"/>
-        </w:rPr>
-        <w:t xml:space="preserve"> = </w:t>
-      </w:r>
-      <w:proofErr w:type="spellStart"/>
+      <w:r>
+        <w:rPr>
+          <w:rFonts w:ascii="Consolas" w:eastAsia="Consolas" w:hAnsi="Consolas"/>
+          <w:color w:val="232323"/>
+          <w:sz w:val="18"/>
+        </w:rPr>
+        <w:t xml:space="preserve"> clock = </w:t>
+      </w:r>
       <w:r>
         <w:rPr>
           <w:rFonts w:ascii="Consolas" w:eastAsia="Consolas" w:hAnsi="Consolas"/>
@@ -17059,115 +16048,23 @@
         </w:rPr>
         <w:t>new</w:t>
       </w:r>
-      <w:proofErr w:type="spellEnd"/>
-      <w:r>
-        <w:rPr>
-          <w:rFonts w:ascii="Consolas" w:eastAsia="Consolas" w:hAnsi="Consolas"/>
-          <w:color w:val="232323"/>
-          <w:sz w:val="18"/>
-        </w:rPr>
-        <w:t xml:space="preserve"> </w:t>
-      </w:r>
-      <w:proofErr w:type="spellStart"/>
-      <w:r>
-        <w:rPr>
-          <w:rFonts w:ascii="Consolas" w:eastAsia="Consolas" w:hAnsi="Consolas"/>
-          <w:color w:val="232323"/>
-          <w:sz w:val="18"/>
-        </w:rPr>
-        <w:t>Mock</w:t>
-      </w:r>
-      <w:proofErr w:type="spellEnd"/>
-      <w:r>
-        <w:rPr>
-          <w:rFonts w:ascii="Consolas" w:eastAsia="Consolas" w:hAnsi="Consolas"/>
-          <w:color w:val="232323"/>
-          <w:sz w:val="18"/>
-        </w:rPr>
-        <w:t>&lt;</w:t>
-      </w:r>
-      <w:proofErr w:type="spellStart"/>
-      <w:r>
-        <w:rPr>
-          <w:rFonts w:ascii="Consolas" w:eastAsia="Consolas" w:hAnsi="Consolas"/>
-          <w:color w:val="232323"/>
-          <w:sz w:val="18"/>
-        </w:rPr>
-        <w:t>IClock</w:t>
-      </w:r>
-      <w:proofErr w:type="spellEnd"/>
-      <w:r>
-        <w:rPr>
-          <w:rFonts w:ascii="Consolas" w:eastAsia="Consolas" w:hAnsi="Consolas"/>
-          <w:color w:val="232323"/>
-          <w:sz w:val="18"/>
-        </w:rPr>
-        <w:t>&gt;();</w:t>
-      </w:r>
-      <w:r>
-        <w:rPr>
-          <w:rFonts w:ascii="Consolas" w:eastAsia="Consolas" w:hAnsi="Consolas"/>
-          <w:color w:val="232323"/>
-          <w:sz w:val="18"/>
-        </w:rPr>
-        <w:br/>
-        <w:t xml:space="preserve">    </w:t>
-      </w:r>
-      <w:proofErr w:type="spellStart"/>
-      <w:r>
-        <w:rPr>
-          <w:rFonts w:ascii="Consolas" w:eastAsia="Consolas" w:hAnsi="Consolas"/>
-          <w:color w:val="232323"/>
-          <w:sz w:val="18"/>
-        </w:rPr>
-        <w:t>clock.SetupGet</w:t>
-      </w:r>
-      <w:proofErr w:type="spellEnd"/>
-      <w:r>
-        <w:rPr>
-          <w:rFonts w:ascii="Consolas" w:eastAsia="Consolas" w:hAnsi="Consolas"/>
-          <w:color w:val="232323"/>
-          <w:sz w:val="18"/>
-        </w:rPr>
-        <w:t xml:space="preserve">(c =&gt; </w:t>
-      </w:r>
-      <w:proofErr w:type="spellStart"/>
-      <w:r>
-        <w:rPr>
-          <w:rFonts w:ascii="Consolas" w:eastAsia="Consolas" w:hAnsi="Consolas"/>
-          <w:color w:val="232323"/>
-          <w:sz w:val="18"/>
-        </w:rPr>
-        <w:t>c.UtcNow</w:t>
-      </w:r>
-      <w:proofErr w:type="spellEnd"/>
-      <w:r>
-        <w:rPr>
-          <w:rFonts w:ascii="Consolas" w:eastAsia="Consolas" w:hAnsi="Consolas"/>
-          <w:color w:val="232323"/>
-          <w:sz w:val="18"/>
-        </w:rPr>
-        <w:t>).</w:t>
-      </w:r>
-      <w:proofErr w:type="spellStart"/>
-      <w:r>
-        <w:rPr>
-          <w:rFonts w:ascii="Consolas" w:eastAsia="Consolas" w:hAnsi="Consolas"/>
-          <w:color w:val="232323"/>
-          <w:sz w:val="18"/>
-        </w:rPr>
-        <w:t>Returns</w:t>
-      </w:r>
-      <w:proofErr w:type="spellEnd"/>
-      <w:r>
-        <w:rPr>
-          <w:rFonts w:ascii="Consolas" w:eastAsia="Consolas" w:hAnsi="Consolas"/>
-          <w:color w:val="232323"/>
-          <w:sz w:val="18"/>
-        </w:rPr>
-        <w:t>(</w:t>
-      </w:r>
-      <w:proofErr w:type="spellStart"/>
+      <w:r>
+        <w:rPr>
+          <w:rFonts w:ascii="Consolas" w:eastAsia="Consolas" w:hAnsi="Consolas"/>
+          <w:color w:val="232323"/>
+          <w:sz w:val="18"/>
+        </w:rPr>
+        <w:t xml:space="preserve"> Mock&lt;IClock&gt;();</w:t>
+      </w:r>
+      <w:r>
+        <w:rPr>
+          <w:rFonts w:ascii="Consolas" w:eastAsia="Consolas" w:hAnsi="Consolas"/>
+          <w:color w:val="232323"/>
+          <w:sz w:val="18"/>
+        </w:rPr>
+        <w:br/>
+        <w:t xml:space="preserve">    clock.SetupGet(c =&gt; c.UtcNow).Returns(</w:t>
+      </w:r>
       <w:r>
         <w:rPr>
           <w:rFonts w:ascii="Consolas" w:eastAsia="Consolas" w:hAnsi="Consolas"/>
@@ -17177,32 +16074,13 @@
         </w:rPr>
         <w:t>new</w:t>
       </w:r>
-      <w:proofErr w:type="spellEnd"/>
-      <w:r>
-        <w:rPr>
-          <w:rFonts w:ascii="Consolas" w:eastAsia="Consolas" w:hAnsi="Consolas"/>
-          <w:color w:val="232323"/>
-          <w:sz w:val="18"/>
-        </w:rPr>
-        <w:t xml:space="preserve"> </w:t>
-      </w:r>
-      <w:proofErr w:type="spellStart"/>
-      <w:r>
-        <w:rPr>
-          <w:rFonts w:ascii="Consolas" w:eastAsia="Consolas" w:hAnsi="Consolas"/>
-          <w:color w:val="232323"/>
-          <w:sz w:val="18"/>
-        </w:rPr>
-        <w:t>DateTime</w:t>
-      </w:r>
-      <w:proofErr w:type="spellEnd"/>
-      <w:r>
-        <w:rPr>
-          <w:rFonts w:ascii="Consolas" w:eastAsia="Consolas" w:hAnsi="Consolas"/>
-          <w:color w:val="232323"/>
-          <w:sz w:val="18"/>
-        </w:rPr>
-        <w:t>(</w:t>
+      <w:r>
+        <w:rPr>
+          <w:rFonts w:ascii="Consolas" w:eastAsia="Consolas" w:hAnsi="Consolas"/>
+          <w:color w:val="232323"/>
+          <w:sz w:val="18"/>
+        </w:rPr>
+        <w:t xml:space="preserve"> DateTime(</w:t>
       </w:r>
       <w:r>
         <w:rPr>
@@ -17269,7 +16147,6 @@
         <w:br/>
         <w:t xml:space="preserve">    </w:t>
       </w:r>
-      <w:proofErr w:type="spellStart"/>
       <w:r>
         <w:rPr>
           <w:rFonts w:ascii="Consolas" w:eastAsia="Consolas" w:hAnsi="Consolas"/>
@@ -17279,34 +16156,14 @@
         </w:rPr>
         <w:t>var</w:t>
       </w:r>
-      <w:proofErr w:type="spellEnd"/>
-      <w:r>
-        <w:rPr>
-          <w:rFonts w:ascii="Consolas" w:eastAsia="Consolas" w:hAnsi="Consolas"/>
-          <w:color w:val="232323"/>
-          <w:sz w:val="18"/>
-        </w:rPr>
-        <w:t xml:space="preserve"> </w:t>
-      </w:r>
-      <w:proofErr w:type="spellStart"/>
-      <w:r>
-        <w:rPr>
-          <w:rFonts w:ascii="Consolas" w:eastAsia="Consolas" w:hAnsi="Consolas"/>
-          <w:color w:val="232323"/>
-          <w:sz w:val="18"/>
-        </w:rPr>
-        <w:t>service</w:t>
-      </w:r>
-      <w:proofErr w:type="spellEnd"/>
-      <w:r>
-        <w:rPr>
-          <w:rFonts w:ascii="Consolas" w:eastAsia="Consolas" w:hAnsi="Consolas"/>
-          <w:color w:val="232323"/>
-          <w:sz w:val="18"/>
-        </w:rPr>
-        <w:t xml:space="preserve"> = </w:t>
-      </w:r>
-      <w:proofErr w:type="spellStart"/>
+      <w:r>
+        <w:rPr>
+          <w:rFonts w:ascii="Consolas" w:eastAsia="Consolas" w:hAnsi="Consolas"/>
+          <w:color w:val="232323"/>
+          <w:sz w:val="18"/>
+        </w:rPr>
+        <w:t xml:space="preserve"> service = </w:t>
+      </w:r>
       <w:r>
         <w:rPr>
           <w:rFonts w:ascii="Consolas" w:eastAsia="Consolas" w:hAnsi="Consolas"/>
@@ -17316,68 +16173,13 @@
         </w:rPr>
         <w:t>new</w:t>
       </w:r>
-      <w:proofErr w:type="spellEnd"/>
-      <w:r>
-        <w:rPr>
-          <w:rFonts w:ascii="Consolas" w:eastAsia="Consolas" w:hAnsi="Consolas"/>
-          <w:color w:val="232323"/>
-          <w:sz w:val="18"/>
-        </w:rPr>
-        <w:t xml:space="preserve"> </w:t>
-      </w:r>
-      <w:proofErr w:type="spellStart"/>
-      <w:r>
-        <w:rPr>
-          <w:rFonts w:ascii="Consolas" w:eastAsia="Consolas" w:hAnsi="Consolas"/>
-          <w:color w:val="232323"/>
-          <w:sz w:val="18"/>
-        </w:rPr>
-        <w:t>ReservationService</w:t>
-      </w:r>
-      <w:proofErr w:type="spellEnd"/>
-      <w:r>
-        <w:rPr>
-          <w:rFonts w:ascii="Consolas" w:eastAsia="Consolas" w:hAnsi="Consolas"/>
-          <w:color w:val="232323"/>
-          <w:sz w:val="18"/>
-        </w:rPr>
-        <w:t>(</w:t>
-      </w:r>
-      <w:proofErr w:type="spellStart"/>
-      <w:r>
-        <w:rPr>
-          <w:rFonts w:ascii="Consolas" w:eastAsia="Consolas" w:hAnsi="Consolas"/>
-          <w:color w:val="232323"/>
-          <w:sz w:val="18"/>
-        </w:rPr>
-        <w:t>repository.Object</w:t>
-      </w:r>
-      <w:proofErr w:type="spellEnd"/>
-      <w:r>
-        <w:rPr>
-          <w:rFonts w:ascii="Consolas" w:eastAsia="Consolas" w:hAnsi="Consolas"/>
-          <w:color w:val="232323"/>
-          <w:sz w:val="18"/>
-        </w:rPr>
-        <w:t xml:space="preserve">, </w:t>
-      </w:r>
-      <w:proofErr w:type="spellStart"/>
-      <w:r>
-        <w:rPr>
-          <w:rFonts w:ascii="Consolas" w:eastAsia="Consolas" w:hAnsi="Consolas"/>
-          <w:color w:val="232323"/>
-          <w:sz w:val="18"/>
-        </w:rPr>
-        <w:t>clock.Object</w:t>
-      </w:r>
-      <w:proofErr w:type="spellEnd"/>
-      <w:r>
-        <w:rPr>
-          <w:rFonts w:ascii="Consolas" w:eastAsia="Consolas" w:hAnsi="Consolas"/>
-          <w:color w:val="232323"/>
-          <w:sz w:val="18"/>
-        </w:rPr>
-        <w:t>);</w:t>
+      <w:r>
+        <w:rPr>
+          <w:rFonts w:ascii="Consolas" w:eastAsia="Consolas" w:hAnsi="Consolas"/>
+          <w:color w:val="232323"/>
+          <w:sz w:val="18"/>
+        </w:rPr>
+        <w:t xml:space="preserve"> ReservationService(repository.Object, clock.Object);</w:t>
       </w:r>
       <w:r>
         <w:rPr>
@@ -17402,24 +16204,14 @@
           <w:color w:val="46815E"/>
           <w:sz w:val="18"/>
         </w:rPr>
-        <w:t xml:space="preserve">// </w:t>
-      </w:r>
-      <w:proofErr w:type="spellStart"/>
+        <w:t>// Act</w:t>
+      </w:r>
       <w:r>
         <w:rPr>
           <w:rFonts w:ascii="Consolas" w:eastAsia="Consolas" w:hAnsi="Consolas"/>
           <w:color w:val="46815E"/>
           <w:sz w:val="18"/>
         </w:rPr>
-        <w:t>Act</w:t>
-      </w:r>
-      <w:proofErr w:type="spellEnd"/>
-      <w:r>
-        <w:rPr>
-          <w:rFonts w:ascii="Consolas" w:eastAsia="Consolas" w:hAnsi="Consolas"/>
-          <w:color w:val="46815E"/>
-          <w:sz w:val="18"/>
-        </w:rPr>
         <w:br/>
       </w:r>
       <w:r>
@@ -17430,7 +16222,6 @@
         </w:rPr>
         <w:t xml:space="preserve">    </w:t>
       </w:r>
-      <w:proofErr w:type="spellStart"/>
       <w:r>
         <w:rPr>
           <w:rFonts w:ascii="Consolas" w:eastAsia="Consolas" w:hAnsi="Consolas"/>
@@ -17440,68 +16231,13 @@
         </w:rPr>
         <w:t>var</w:t>
       </w:r>
-      <w:proofErr w:type="spellEnd"/>
-      <w:r>
-        <w:rPr>
-          <w:rFonts w:ascii="Consolas" w:eastAsia="Consolas" w:hAnsi="Consolas"/>
-          <w:color w:val="232323"/>
-          <w:sz w:val="18"/>
-        </w:rPr>
-        <w:t xml:space="preserve"> </w:t>
-      </w:r>
-      <w:proofErr w:type="spellStart"/>
-      <w:r>
-        <w:rPr>
-          <w:rFonts w:ascii="Consolas" w:eastAsia="Consolas" w:hAnsi="Consolas"/>
-          <w:color w:val="232323"/>
-          <w:sz w:val="18"/>
-        </w:rPr>
-        <w:t>result</w:t>
-      </w:r>
-      <w:proofErr w:type="spellEnd"/>
-      <w:r>
-        <w:rPr>
-          <w:rFonts w:ascii="Consolas" w:eastAsia="Consolas" w:hAnsi="Consolas"/>
-          <w:color w:val="232323"/>
-          <w:sz w:val="18"/>
-        </w:rPr>
-        <w:t xml:space="preserve"> = </w:t>
-      </w:r>
-      <w:proofErr w:type="spellStart"/>
-      <w:r>
-        <w:rPr>
-          <w:rFonts w:ascii="Consolas" w:eastAsia="Consolas" w:hAnsi="Consolas"/>
-          <w:color w:val="232323"/>
-          <w:sz w:val="18"/>
-        </w:rPr>
-        <w:t>service.Reserve</w:t>
-      </w:r>
-      <w:proofErr w:type="spellEnd"/>
-      <w:r>
-        <w:rPr>
-          <w:rFonts w:ascii="Consolas" w:eastAsia="Consolas" w:hAnsi="Consolas"/>
-          <w:color w:val="232323"/>
-          <w:sz w:val="18"/>
-        </w:rPr>
-        <w:t>(</w:t>
-      </w:r>
-      <w:proofErr w:type="spellStart"/>
-      <w:r>
-        <w:rPr>
-          <w:rFonts w:ascii="Consolas" w:eastAsia="Consolas" w:hAnsi="Consolas"/>
-          <w:color w:val="232323"/>
-          <w:sz w:val="18"/>
-        </w:rPr>
-        <w:t>TestRequests.ValidFutureReservation</w:t>
-      </w:r>
-      <w:proofErr w:type="spellEnd"/>
-      <w:r>
-        <w:rPr>
-          <w:rFonts w:ascii="Consolas" w:eastAsia="Consolas" w:hAnsi="Consolas"/>
-          <w:color w:val="232323"/>
-          <w:sz w:val="18"/>
-        </w:rPr>
-        <w:t>());</w:t>
+      <w:r>
+        <w:rPr>
+          <w:rFonts w:ascii="Consolas" w:eastAsia="Consolas" w:hAnsi="Consolas"/>
+          <w:color w:val="232323"/>
+          <w:sz w:val="18"/>
+        </w:rPr>
+        <w:t xml:space="preserve"> result = service.Reserve(TestRequests.ValidFutureReservation());</w:t>
       </w:r>
       <w:r>
         <w:rPr>
@@ -17526,150 +16262,32 @@
           <w:color w:val="46815E"/>
           <w:sz w:val="18"/>
         </w:rPr>
-        <w:t xml:space="preserve">// </w:t>
-      </w:r>
-      <w:proofErr w:type="spellStart"/>
+        <w:t>// Assert</w:t>
+      </w:r>
       <w:r>
         <w:rPr>
           <w:rFonts w:ascii="Consolas" w:eastAsia="Consolas" w:hAnsi="Consolas"/>
           <w:color w:val="46815E"/>
           <w:sz w:val="18"/>
         </w:rPr>
-        <w:t>Assert</w:t>
-      </w:r>
-      <w:proofErr w:type="spellEnd"/>
-      <w:r>
-        <w:rPr>
-          <w:rFonts w:ascii="Consolas" w:eastAsia="Consolas" w:hAnsi="Consolas"/>
-          <w:color w:val="46815E"/>
-          <w:sz w:val="18"/>
-        </w:rPr>
-        <w:br/>
-      </w:r>
-      <w:r>
-        <w:rPr>
-          <w:rFonts w:ascii="Consolas" w:eastAsia="Consolas" w:hAnsi="Consolas"/>
-          <w:color w:val="232323"/>
-          <w:sz w:val="18"/>
-        </w:rPr>
-        <w:t xml:space="preserve">    </w:t>
-      </w:r>
-      <w:proofErr w:type="spellStart"/>
-      <w:r>
-        <w:rPr>
-          <w:rFonts w:ascii="Consolas" w:eastAsia="Consolas" w:hAnsi="Consolas"/>
-          <w:color w:val="232323"/>
-          <w:sz w:val="18"/>
-        </w:rPr>
-        <w:t>Assert.That</w:t>
-      </w:r>
-      <w:proofErr w:type="spellEnd"/>
-      <w:r>
-        <w:rPr>
-          <w:rFonts w:ascii="Consolas" w:eastAsia="Consolas" w:hAnsi="Consolas"/>
-          <w:color w:val="232323"/>
-          <w:sz w:val="18"/>
-        </w:rPr>
-        <w:t>(</w:t>
-      </w:r>
-      <w:proofErr w:type="spellStart"/>
-      <w:r>
-        <w:rPr>
-          <w:rFonts w:ascii="Consolas" w:eastAsia="Consolas" w:hAnsi="Consolas"/>
-          <w:color w:val="232323"/>
-          <w:sz w:val="18"/>
-        </w:rPr>
-        <w:t>result.Success</w:t>
-      </w:r>
-      <w:proofErr w:type="spellEnd"/>
-      <w:r>
-        <w:rPr>
-          <w:rFonts w:ascii="Consolas" w:eastAsia="Consolas" w:hAnsi="Consolas"/>
-          <w:color w:val="232323"/>
-          <w:sz w:val="18"/>
-        </w:rPr>
-        <w:t xml:space="preserve">, </w:t>
-      </w:r>
-      <w:proofErr w:type="spellStart"/>
-      <w:r>
-        <w:rPr>
-          <w:rFonts w:ascii="Consolas" w:eastAsia="Consolas" w:hAnsi="Consolas"/>
-          <w:color w:val="232323"/>
-          <w:sz w:val="18"/>
-        </w:rPr>
-        <w:t>Is.False</w:t>
-      </w:r>
-      <w:proofErr w:type="spellEnd"/>
-      <w:r>
-        <w:rPr>
-          <w:rFonts w:ascii="Consolas" w:eastAsia="Consolas" w:hAnsi="Consolas"/>
-          <w:color w:val="232323"/>
-          <w:sz w:val="18"/>
-        </w:rPr>
-        <w:t>);</w:t>
-      </w:r>
-      <w:r>
-        <w:rPr>
-          <w:rFonts w:ascii="Consolas" w:eastAsia="Consolas" w:hAnsi="Consolas"/>
-          <w:color w:val="232323"/>
-          <w:sz w:val="18"/>
-        </w:rPr>
-        <w:br/>
-        <w:t xml:space="preserve">    </w:t>
-      </w:r>
-      <w:proofErr w:type="spellStart"/>
-      <w:r>
-        <w:rPr>
-          <w:rFonts w:ascii="Consolas" w:eastAsia="Consolas" w:hAnsi="Consolas"/>
-          <w:color w:val="232323"/>
-          <w:sz w:val="18"/>
-        </w:rPr>
-        <w:t>Assert.That</w:t>
-      </w:r>
-      <w:proofErr w:type="spellEnd"/>
-      <w:r>
-        <w:rPr>
-          <w:rFonts w:ascii="Consolas" w:eastAsia="Consolas" w:hAnsi="Consolas"/>
-          <w:color w:val="232323"/>
-          <w:sz w:val="18"/>
-        </w:rPr>
-        <w:t>(</w:t>
-      </w:r>
-      <w:proofErr w:type="spellStart"/>
-      <w:r>
-        <w:rPr>
-          <w:rFonts w:ascii="Consolas" w:eastAsia="Consolas" w:hAnsi="Consolas"/>
-          <w:color w:val="232323"/>
-          <w:sz w:val="18"/>
-        </w:rPr>
-        <w:t>result.Error</w:t>
-      </w:r>
-      <w:proofErr w:type="spellEnd"/>
-      <w:r>
-        <w:rPr>
-          <w:rFonts w:ascii="Consolas" w:eastAsia="Consolas" w:hAnsi="Consolas"/>
-          <w:color w:val="232323"/>
-          <w:sz w:val="18"/>
-        </w:rPr>
-        <w:t xml:space="preserve">, </w:t>
-      </w:r>
-      <w:proofErr w:type="spellStart"/>
-      <w:r>
-        <w:rPr>
-          <w:rFonts w:ascii="Consolas" w:eastAsia="Consolas" w:hAnsi="Consolas"/>
-          <w:color w:val="232323"/>
-          <w:sz w:val="18"/>
-        </w:rPr>
-        <w:t>Is.EqualTo</w:t>
-      </w:r>
-      <w:proofErr w:type="spellEnd"/>
-      <w:r>
-        <w:rPr>
-          <w:rFonts w:ascii="Consolas" w:eastAsia="Consolas" w:hAnsi="Consolas"/>
-          <w:color w:val="232323"/>
-          <w:sz w:val="18"/>
-        </w:rPr>
-        <w:t>(</w:t>
+        <w:br/>
+      </w:r>
+      <w:r>
+        <w:rPr>
+          <w:rFonts w:ascii="Consolas" w:eastAsia="Consolas" w:hAnsi="Consolas"/>
+          <w:color w:val="232323"/>
+          <w:sz w:val="18"/>
+        </w:rPr>
+        <w:t xml:space="preserve">    Assert.That(result.Success, Is.False);</w:t>
+      </w:r>
+      <w:r>
+        <w:rPr>
+          <w:rFonts w:ascii="Consolas" w:eastAsia="Consolas" w:hAnsi="Consolas"/>
+          <w:color w:val="232323"/>
+          <w:sz w:val="18"/>
+        </w:rPr>
+        <w:br/>
+        <w:t xml:space="preserve">    Assert.That(result.Error, Is.EqualTo(</w:t>
       </w:r>
       <w:r>
         <w:rPr>
@@ -17677,25 +16295,7 @@
           <w:color w:val="9A4C31"/>
           <w:sz w:val="18"/>
         </w:rPr>
-        <w:t>"</w:t>
-      </w:r>
-      <w:proofErr w:type="spellStart"/>
-      <w:r>
-        <w:rPr>
-          <w:rFonts w:ascii="Consolas" w:eastAsia="Consolas" w:hAnsi="Consolas"/>
-          <w:color w:val="9A4C31"/>
-          <w:sz w:val="18"/>
-        </w:rPr>
-        <w:t>OverlappingReservation</w:t>
-      </w:r>
-      <w:proofErr w:type="spellEnd"/>
-      <w:r>
-        <w:rPr>
-          <w:rFonts w:ascii="Consolas" w:eastAsia="Consolas" w:hAnsi="Consolas"/>
-          <w:color w:val="9A4C31"/>
-          <w:sz w:val="18"/>
-        </w:rPr>
-        <w:t>"</w:t>
+        <w:t>"OverlappingReservation"</w:t>
       </w:r>
       <w:r>
         <w:rPr>
@@ -17712,97 +16312,7 @@
           <w:sz w:val="18"/>
         </w:rPr>
         <w:br/>
-        <w:t xml:space="preserve">    </w:t>
-      </w:r>
-      <w:proofErr w:type="spellStart"/>
-      <w:r>
-        <w:rPr>
-          <w:rFonts w:ascii="Consolas" w:eastAsia="Consolas" w:hAnsi="Consolas"/>
-          <w:color w:val="232323"/>
-          <w:sz w:val="18"/>
-        </w:rPr>
-        <w:t>repository.Verify</w:t>
-      </w:r>
-      <w:proofErr w:type="spellEnd"/>
-      <w:r>
-        <w:rPr>
-          <w:rFonts w:ascii="Consolas" w:eastAsia="Consolas" w:hAnsi="Consolas"/>
-          <w:color w:val="232323"/>
-          <w:sz w:val="18"/>
-        </w:rPr>
-        <w:t xml:space="preserve">(r =&gt; </w:t>
-      </w:r>
-      <w:proofErr w:type="spellStart"/>
-      <w:r>
-        <w:rPr>
-          <w:rFonts w:ascii="Consolas" w:eastAsia="Consolas" w:hAnsi="Consolas"/>
-          <w:color w:val="232323"/>
-          <w:sz w:val="18"/>
-        </w:rPr>
-        <w:t>r.Add</w:t>
-      </w:r>
-      <w:proofErr w:type="spellEnd"/>
-      <w:r>
-        <w:rPr>
-          <w:rFonts w:ascii="Consolas" w:eastAsia="Consolas" w:hAnsi="Consolas"/>
-          <w:color w:val="232323"/>
-          <w:sz w:val="18"/>
-        </w:rPr>
-        <w:t>(</w:t>
-      </w:r>
-      <w:proofErr w:type="spellStart"/>
-      <w:r>
-        <w:rPr>
-          <w:rFonts w:ascii="Consolas" w:eastAsia="Consolas" w:hAnsi="Consolas"/>
-          <w:color w:val="232323"/>
-          <w:sz w:val="18"/>
-        </w:rPr>
-        <w:t>It.IsAny</w:t>
-      </w:r>
-      <w:proofErr w:type="spellEnd"/>
-      <w:r>
-        <w:rPr>
-          <w:rFonts w:ascii="Consolas" w:eastAsia="Consolas" w:hAnsi="Consolas"/>
-          <w:color w:val="232323"/>
-          <w:sz w:val="18"/>
-        </w:rPr>
-        <w:t>&lt;</w:t>
-      </w:r>
-      <w:proofErr w:type="spellStart"/>
-      <w:r>
-        <w:rPr>
-          <w:rFonts w:ascii="Consolas" w:eastAsia="Consolas" w:hAnsi="Consolas"/>
-          <w:color w:val="232323"/>
-          <w:sz w:val="18"/>
-        </w:rPr>
-        <w:t>Reservation</w:t>
-      </w:r>
-      <w:proofErr w:type="spellEnd"/>
-      <w:r>
-        <w:rPr>
-          <w:rFonts w:ascii="Consolas" w:eastAsia="Consolas" w:hAnsi="Consolas"/>
-          <w:color w:val="232323"/>
-          <w:sz w:val="18"/>
-        </w:rPr>
-        <w:t xml:space="preserve">&gt;()), </w:t>
-      </w:r>
-      <w:proofErr w:type="spellStart"/>
-      <w:r>
-        <w:rPr>
-          <w:rFonts w:ascii="Consolas" w:eastAsia="Consolas" w:hAnsi="Consolas"/>
-          <w:color w:val="232323"/>
-          <w:sz w:val="18"/>
-        </w:rPr>
-        <w:t>Times.Never</w:t>
-      </w:r>
-      <w:proofErr w:type="spellEnd"/>
-      <w:r>
-        <w:rPr>
-          <w:rFonts w:ascii="Consolas" w:eastAsia="Consolas" w:hAnsi="Consolas"/>
-          <w:color w:val="232323"/>
-          <w:sz w:val="18"/>
-        </w:rPr>
-        <w:t>);</w:t>
+        <w:t xml:space="preserve">    repository.Verify(r =&gt; r.Add(It.IsAny&lt;Reservation&gt;()), Times.Never);</w:t>
       </w:r>
       <w:r>
         <w:rPr>
@@ -17869,7 +16379,7 @@
                     <pic:cNvPicPr/>
                   </pic:nvPicPr>
                   <pic:blipFill>
-                    <a:blip r:embed="rId23"/>
+                    <a:blip r:embed="rId25"/>
                     <a:stretch>
                       <a:fillRect/>
                     </a:stretch>
@@ -17896,15 +16406,7 @@
         </w:drawing>
       </w:r>
       <w:r>
-        <w:t xml:space="preserve">Ако тест престаје да пролази сваки пут када се приватна метода преименује или се код рефакторише без промене споља видљивог понашања, тест је вероватно превише везан за </w:t>
-      </w:r>
-      <w:proofErr w:type="spellStart"/>
-      <w:r>
-        <w:t>имплементационе</w:t>
-      </w:r>
-      <w:proofErr w:type="spellEnd"/>
-      <w:r>
-        <w:t xml:space="preserve"> детаље.</w:t>
+        <w:t>Ако тест престаје да пролази сваки пут када се приватна метода преименује или се код рефакторише без промене споља видљивог понашања, тест је вероватно превише везан за имплементационе детаље.</w:t>
       </w:r>
     </w:p>
     <w:p>
@@ -19099,7 +17601,7 @@
                     <pic:cNvPicPr/>
                   </pic:nvPicPr>
                   <pic:blipFill>
-                    <a:blip r:embed="rId24"/>
+                    <a:blip r:embed="rId26"/>
                     <a:stretch>
                       <a:fillRect/>
                     </a:stretch>
@@ -19346,7 +17848,7 @@
                     <pic:cNvPicPr/>
                   </pic:nvPicPr>
                   <pic:blipFill>
-                    <a:blip r:embed="rId25"/>
+                    <a:blip r:embed="rId27"/>
                     <a:stretch>
                       <a:fillRect/>
                     </a:stretch>
@@ -25154,7 +23656,7 @@
                     <pic:cNvPicPr/>
                   </pic:nvPicPr>
                   <pic:blipFill>
-                    <a:blip r:embed="rId26"/>
+                    <a:blip r:embed="rId28"/>
                     <a:stretch>
                       <a:fillRect/>
                     </a:stretch>
@@ -25541,7 +24043,6 @@
         <w:ind w:left="204" w:right="45"/>
         <w:jc w:val="left"/>
       </w:pPr>
-      <w:proofErr w:type="spellStart"/>
       <w:r>
         <w:rPr>
           <w:rFonts w:ascii="Consolas" w:eastAsia="Consolas" w:hAnsi="Consolas"/>
@@ -25549,97 +24050,25 @@
           <w:sz w:val="18"/>
         </w:rPr>
         <w:lastRenderedPageBreak/>
-        <w:t>ollama</w:t>
-      </w:r>
-      <w:proofErr w:type="spellEnd"/>
-      <w:r>
-        <w:rPr>
-          <w:rFonts w:ascii="Consolas" w:eastAsia="Consolas" w:hAnsi="Consolas"/>
-          <w:color w:val="232323"/>
-          <w:sz w:val="18"/>
-        </w:rPr>
-        <w:t xml:space="preserve"> </w:t>
-      </w:r>
-      <w:proofErr w:type="spellStart"/>
-      <w:r>
-        <w:rPr>
-          <w:rFonts w:ascii="Consolas" w:eastAsia="Consolas" w:hAnsi="Consolas"/>
-          <w:color w:val="232323"/>
-          <w:sz w:val="18"/>
-        </w:rPr>
-        <w:t>pull</w:t>
-      </w:r>
-      <w:proofErr w:type="spellEnd"/>
-      <w:r>
-        <w:rPr>
-          <w:rFonts w:ascii="Consolas" w:eastAsia="Consolas" w:hAnsi="Consolas"/>
-          <w:color w:val="232323"/>
-          <w:sz w:val="18"/>
-        </w:rPr>
-        <w:t xml:space="preserve"> qwen3:4b</w:t>
-      </w:r>
-      <w:r>
-        <w:rPr>
-          <w:rFonts w:ascii="Consolas" w:eastAsia="Consolas" w:hAnsi="Consolas"/>
-          <w:color w:val="232323"/>
-          <w:sz w:val="18"/>
-        </w:rPr>
-        <w:br/>
-        <w:t xml:space="preserve">cd </w:t>
-      </w:r>
-      <w:proofErr w:type="spellStart"/>
-      <w:r>
-        <w:rPr>
-          <w:rFonts w:ascii="Consolas" w:eastAsia="Consolas" w:hAnsi="Consolas"/>
-          <w:color w:val="232323"/>
-          <w:sz w:val="18"/>
-        </w:rPr>
-        <w:t>ers-ai-workflow</w:t>
-      </w:r>
-      <w:proofErr w:type="spellEnd"/>
-      <w:r>
-        <w:rPr>
-          <w:rFonts w:ascii="Consolas" w:eastAsia="Consolas" w:hAnsi="Consolas"/>
-          <w:color w:val="232323"/>
-          <w:sz w:val="18"/>
-        </w:rPr>
-        <w:br/>
-      </w:r>
-      <w:proofErr w:type="spellStart"/>
-      <w:r>
-        <w:rPr>
-          <w:rFonts w:ascii="Consolas" w:eastAsia="Consolas" w:hAnsi="Consolas"/>
-          <w:color w:val="232323"/>
-          <w:sz w:val="18"/>
-        </w:rPr>
-        <w:t>dotnet</w:t>
-      </w:r>
-      <w:proofErr w:type="spellEnd"/>
-      <w:r>
-        <w:rPr>
-          <w:rFonts w:ascii="Consolas" w:eastAsia="Consolas" w:hAnsi="Consolas"/>
-          <w:color w:val="232323"/>
-          <w:sz w:val="18"/>
-        </w:rPr>
-        <w:t xml:space="preserve"> </w:t>
-      </w:r>
-      <w:proofErr w:type="spellStart"/>
-      <w:r>
-        <w:rPr>
-          <w:rFonts w:ascii="Consolas" w:eastAsia="Consolas" w:hAnsi="Consolas"/>
-          <w:color w:val="232323"/>
-          <w:sz w:val="18"/>
-        </w:rPr>
-        <w:t>build</w:t>
-      </w:r>
-      <w:proofErr w:type="spellEnd"/>
-      <w:r>
-        <w:rPr>
-          <w:rFonts w:ascii="Consolas" w:eastAsia="Consolas" w:hAnsi="Consolas"/>
-          <w:color w:val="232323"/>
-          <w:sz w:val="18"/>
-        </w:rPr>
-        <w:t xml:space="preserve"> EquipmentReservation.sln --configuration Release</w:t>
+        <w:t>ollama pull qwen3:4b</w:t>
+      </w:r>
+      <w:r>
+        <w:rPr>
+          <w:rFonts w:ascii="Consolas" w:eastAsia="Consolas" w:hAnsi="Consolas"/>
+          <w:color w:val="232323"/>
+          <w:sz w:val="18"/>
+        </w:rPr>
+        <w:br/>
+        <w:t>cd ers-ai-workflow</w:t>
+      </w:r>
+      <w:r>
+        <w:rPr>
+          <w:rFonts w:ascii="Consolas" w:eastAsia="Consolas" w:hAnsi="Consolas"/>
+          <w:color w:val="232323"/>
+          <w:sz w:val="18"/>
+        </w:rPr>
+        <w:br/>
+        <w:t>dotnet build EquipmentReservation.sln --configuration Release</w:t>
       </w:r>
       <w:r>
         <w:rPr>
@@ -25705,14 +24134,12 @@
       <w:r>
         <w:t xml:space="preserve"> и листа дозвољених команди мењају се преко </w:t>
       </w:r>
-      <w:proofErr w:type="spellStart"/>
       <w:r>
         <w:rPr>
           <w:i/>
         </w:rPr>
         <w:t>Kova</w:t>
       </w:r>
-      <w:proofErr w:type="spellEnd"/>
       <w:r>
         <w:t xml:space="preserve">: </w:t>
       </w:r>
@@ -29081,7 +27508,7 @@
                     <pic:cNvPicPr/>
                   </pic:nvPicPr>
                   <pic:blipFill>
-                    <a:blip r:embed="rId27"/>
+                    <a:blip r:embed="rId29"/>
                     <a:stretch>
                       <a:fillRect/>
                     </a:stretch>
@@ -29142,7 +27569,7 @@
                     <pic:cNvPicPr/>
                   </pic:nvPicPr>
                   <pic:blipFill>
-                    <a:blip r:embed="rId28"/>
+                    <a:blip r:embed="rId30"/>
                     <a:stretch>
                       <a:fillRect/>
                     </a:stretch>
@@ -33628,7 +32055,7 @@
                     <pic:cNvPicPr/>
                   </pic:nvPicPr>
                   <pic:blipFill>
-                    <a:blip r:embed="rId29"/>
+                    <a:blip r:embed="rId31"/>
                     <a:stretch>
                       <a:fillRect/>
                     </a:stretch>
@@ -33689,7 +32116,7 @@
                     <pic:cNvPicPr/>
                   </pic:nvPicPr>
                   <pic:blipFill>
-                    <a:blip r:embed="rId30"/>
+                    <a:blip r:embed="rId32"/>
                     <a:stretch>
                       <a:fillRect/>
                     </a:stretch>
@@ -41308,7 +39735,7 @@
         </w:rPr>
         <w:t xml:space="preserve">, 2014. </w:t>
       </w:r>
-      <w:hyperlink r:id="rId31">
+      <w:hyperlink r:id="rId33">
         <w:r>
           <w:rPr>
             <w:sz w:val="20"/>
@@ -41386,7 +39813,7 @@
         </w:rPr>
         <w:t xml:space="preserve">. Новембар 2020. </w:t>
       </w:r>
-      <w:hyperlink r:id="rId32">
+      <w:hyperlink r:id="rId34">
         <w:r>
           <w:rPr>
             <w:sz w:val="20"/>
@@ -41434,7 +39861,7 @@
         </w:rPr>
         <w:t xml:space="preserve">. Званична документација. </w:t>
       </w:r>
-      <w:hyperlink r:id="rId33">
+      <w:hyperlink r:id="rId35">
         <w:r>
           <w:rPr>
             <w:sz w:val="20"/>
@@ -41465,7 +39892,7 @@
         </w:rPr>
         <w:t xml:space="preserve">. Пројекат и документација. </w:t>
       </w:r>
-      <w:hyperlink r:id="rId34">
+      <w:hyperlink r:id="rId36">
         <w:r>
           <w:rPr>
             <w:sz w:val="20"/>
@@ -41543,7 +39970,7 @@
         </w:rPr>
         <w:t xml:space="preserve">: убризгавање зависности, тестирање и архитектура апликација. </w:t>
       </w:r>
-      <w:hyperlink r:id="rId35">
+      <w:hyperlink r:id="rId37">
         <w:r>
           <w:rPr>
             <w:sz w:val="20"/>
@@ -41621,7 +40048,7 @@
         </w:rPr>
         <w:t xml:space="preserve">. Спецификација и основни концепти. </w:t>
       </w:r>
-      <w:hyperlink r:id="rId36">
+      <w:hyperlink r:id="rId38">
         <w:r>
           <w:rPr>
             <w:sz w:val="20"/>
@@ -41667,41 +40094,9 @@
           <w:sz w:val="20"/>
           <w:szCs w:val="20"/>
         </w:rPr>
-        <w:t>. Пројектна документација. github.com/</w:t>
-      </w:r>
-      <w:proofErr w:type="spellStart"/>
-      <w:r>
-        <w:rPr>
-          <w:sz w:val="20"/>
-          <w:szCs w:val="20"/>
-        </w:rPr>
-        <w:t>owlCoder</w:t>
-      </w:r>
-      <w:proofErr w:type="spellEnd"/>
-      <w:r>
-        <w:rPr>
-          <w:sz w:val="20"/>
-          <w:szCs w:val="20"/>
-        </w:rPr>
-        <w:t>/</w:t>
-      </w:r>
-      <w:proofErr w:type="spellStart"/>
-      <w:r>
-        <w:rPr>
-          <w:sz w:val="20"/>
-          <w:szCs w:val="20"/>
-        </w:rPr>
-        <w:t>kova</w:t>
-      </w:r>
-      <w:proofErr w:type="spellEnd"/>
-      <w:r>
-        <w:rPr>
-          <w:sz w:val="20"/>
-          <w:szCs w:val="20"/>
-        </w:rPr>
-        <w:t>.</w:t>
-      </w:r>
-      <w:hyperlink r:id="rId37"/>
+        <w:t>. Пројектна документација. github.com/owlCoder/kova.</w:t>
+      </w:r>
+      <w:hyperlink r:id="rId39"/>
     </w:p>
     <w:p>
       <w:pPr>
@@ -41736,11 +40131,12 @@
       </w:r>
     </w:p>
     <w:sectPr>
-      <w:footerReference w:type="default" r:id="rId38"/>
+      <w:headerReference w:type="default" r:id="rId40"/>
+      <w:footerReference w:type="default" r:id="rId41"/>
       <w:pgSz w:w="11906" w:h="16838"/>
       <w:pgMar w:top="1446" w:right="1389" w:bottom="1332" w:left="1446" w:header="737" w:footer="737" w:gutter="0"/>
+      <w:pgNumType w:start="1"/>
       <w:cols w:space="720"/>
-      <w:titlePg/>
       <w:docGrid w:linePitch="360"/>
     </w:sectPr>
   </w:body>
@@ -41777,6 +40173,19 @@
   <w:p>
     <w:pPr>
       <w:pStyle w:val="Footer"/>
+    </w:pPr>
+  </w:p>
+</w:ftr>
+</file>
+
+<file path=word/footer2.xml><?xml version="1.0" encoding="utf-8"?>
+<w:ftr xmlns:wpc="http://schemas.microsoft.com/office/word/2010/wordprocessingCanvas" xmlns:cx="http://schemas.microsoft.com/office/drawing/2014/chartex" xmlns:cx1="http://schemas.microsoft.com/office/drawing/2015/9/8/chartex" xmlns:cx2="http://schemas.microsoft.com/office/drawing/2015/10/21/chartex" xmlns:cx3="http://schemas.microsoft.com/office/drawing/2016/5/9/chartex" xmlns:cx4="http://schemas.microsoft.com/office/drawing/2016/5/10/chartex" xmlns:cx5="http://schemas.microsoft.com/office/drawing/2016/5/11/chartex" xmlns:cx6="http://schemas.microsoft.com/office/drawing/2016/5/12/chartex" xmlns:cx7="http://schemas.microsoft.com/office/drawing/2016/5/13/chartex" xmlns:cx8="http://schemas.microsoft.com/office/drawing/2016/5/14/chartex" xmlns:mc="http://schemas.openxmlformats.org/markup-compatibility/2006" xmlns:m="http://schemas.openxmlformats.org/officeDocument/2006/math" xmlns:aink="http://schemas.microsoft.com/office/drawing/2016/ink" xmlns:am3d="http://schemas.microsoft.com/office/drawing/2017/model3d" xmlns:oel="http://schemas.microsoft.com/office/2019/extlst" xmlns:r="http://schemas.openxmlformats.org/officeDocument/2006/relationships" xmlns:wp14="http://schemas.microsoft.com/office/word/2010/wordprocessingDrawing" xmlns:wp="http://schemas.openxmlformats.org/drawingml/2006/wordprocessingDrawing" xmlns:wpg="http://schemas.microsoft.com/office/word/2010/wordprocessingGroup" xmlns:wpi="http://schemas.microsoft.com/office/word/2010/wordprocessingInk" xmlns:wps="http://schemas.microsoft.com/office/word/2010/wordprocessingShape" xmlns:o="urn:schemas-microsoft-com:office:office" xmlns:v="urn:schemas-microsoft-com:vml" xmlns:w10="urn:schemas-microsoft-com:office:word" xmlns:w="http://schemas.openxmlformats.org/wordprocessingml/2006/main" xmlns:w14="http://schemas.microsoft.com/office/word/2010/wordml" xmlns:w15="http://schemas.microsoft.com/office/word/2012/wordml" xmlns:w16cex="http://schemas.microsoft.com/office/word/2018/wordml/cex" xmlns:w16cid="http://schemas.microsoft.com/office/word/2016/wordml/cid" xmlns:w16="http://schemas.microsoft.com/office/word/2018/wordml" xmlns:w16sdtdh="http://schemas.microsoft.com/office/word/2020/wordml/sdtdatahash" xmlns:w16sdtfl="http://schemas.microsoft.com/office/word/2024/wordml/sdtformatlock" xmlns:w16se="http://schemas.microsoft.com/office/word/2015/wordml/symex" xmlns:w16du="http://schemas.microsoft.com/office/word/2023/wordml/word16du" xmlns:wne="http://schemas.microsoft.com/office/word/2006/wordml" mc:Ignorable="w14 w15 w16se w16cid w16 w16cex w16sdtdh w16sdtfl w16du wp14">
+  <w:p>
+    <w:pPr>
+      <w:pStyle w:val="Footer"/>
+      <w:pBdr>
+        <w:top w:val="single" w:sz="5" w:space="5" w:color="777777"/>
+      </w:pBdr>
       <w:jc w:val="right"/>
     </w:pPr>
     <w:r>
@@ -41849,6 +40258,41 @@
     </w:p>
   </w:footnote>
 </w:footnotes>
+</file>
+
+<file path=word/header1.xml><?xml version="1.0" encoding="utf-8"?>
+<w:hdr xmlns:wpc="http://schemas.microsoft.com/office/word/2010/wordprocessingCanvas" xmlns:cx="http://schemas.microsoft.com/office/drawing/2014/chartex" xmlns:cx1="http://schemas.microsoft.com/office/drawing/2015/9/8/chartex" xmlns:cx2="http://schemas.microsoft.com/office/drawing/2015/10/21/chartex" xmlns:cx3="http://schemas.microsoft.com/office/drawing/2016/5/9/chartex" xmlns:cx4="http://schemas.microsoft.com/office/drawing/2016/5/10/chartex" xmlns:cx5="http://schemas.microsoft.com/office/drawing/2016/5/11/chartex" xmlns:cx6="http://schemas.microsoft.com/office/drawing/2016/5/12/chartex" xmlns:cx7="http://schemas.microsoft.com/office/drawing/2016/5/13/chartex" xmlns:cx8="http://schemas.microsoft.com/office/drawing/2016/5/14/chartex" xmlns:mc="http://schemas.openxmlformats.org/markup-compatibility/2006" xmlns:m="http://schemas.openxmlformats.org/officeDocument/2006/math" xmlns:aink="http://schemas.microsoft.com/office/drawing/2016/ink" xmlns:am3d="http://schemas.microsoft.com/office/drawing/2017/model3d" xmlns:oel="http://schemas.microsoft.com/office/2019/extlst" xmlns:r="http://schemas.openxmlformats.org/officeDocument/2006/relationships" xmlns:wp14="http://schemas.microsoft.com/office/word/2010/wordprocessingDrawing" xmlns:wp="http://schemas.openxmlformats.org/drawingml/2006/wordprocessingDrawing" xmlns:wpg="http://schemas.microsoft.com/office/word/2010/wordprocessingGroup" xmlns:wpi="http://schemas.microsoft.com/office/word/2010/wordprocessingInk" xmlns:wps="http://schemas.microsoft.com/office/word/2010/wordprocessingShape" xmlns:o="urn:schemas-microsoft-com:office:office" xmlns:v="urn:schemas-microsoft-com:vml" xmlns:w10="urn:schemas-microsoft-com:office:word" xmlns:w="http://schemas.openxmlformats.org/wordprocessingml/2006/main" xmlns:w14="http://schemas.microsoft.com/office/word/2010/wordml" xmlns:w15="http://schemas.microsoft.com/office/word/2012/wordml" xmlns:w16cex="http://schemas.microsoft.com/office/word/2018/wordml/cex" xmlns:w16cid="http://schemas.microsoft.com/office/word/2016/wordml/cid" xmlns:w16="http://schemas.microsoft.com/office/word/2018/wordml" xmlns:w16sdtdh="http://schemas.microsoft.com/office/word/2020/wordml/sdtdatahash" xmlns:w16sdtfl="http://schemas.microsoft.com/office/word/2024/wordml/sdtformatlock" xmlns:w16se="http://schemas.microsoft.com/office/word/2015/wordml/symex" xmlns:w16du="http://schemas.microsoft.com/office/word/2023/wordml/word16du" xmlns:wne="http://schemas.microsoft.com/office/word/2006/wordml" mc:Ignorable="w14 w15 w16se w16cid w16 w16cex w16sdtdh w16sdtfl w16du wp14">
+  <w:p>
+    <w:pPr>
+      <w:pStyle w:val="Header"/>
+      <w:pBdr>
+        <w:bottom w:val="single" w:sz="5" w:space="5" w:color="777777"/>
+      </w:pBdr>
+      <w:jc w:val="left"/>
+    </w:pPr>
+  </w:p>
+</w:hdr>
+</file>
+
+<file path=word/header2.xml><?xml version="1.0" encoding="utf-8"?>
+<w:hdr xmlns:wpc="http://schemas.microsoft.com/office/word/2010/wordprocessingCanvas" xmlns:cx="http://schemas.microsoft.com/office/drawing/2014/chartex" xmlns:cx1="http://schemas.microsoft.com/office/drawing/2015/9/8/chartex" xmlns:cx2="http://schemas.microsoft.com/office/drawing/2015/10/21/chartex" xmlns:cx3="http://schemas.microsoft.com/office/drawing/2016/5/9/chartex" xmlns:cx4="http://schemas.microsoft.com/office/drawing/2016/5/10/chartex" xmlns:cx5="http://schemas.microsoft.com/office/drawing/2016/5/11/chartex" xmlns:cx6="http://schemas.microsoft.com/office/drawing/2016/5/12/chartex" xmlns:cx7="http://schemas.microsoft.com/office/drawing/2016/5/13/chartex" xmlns:cx8="http://schemas.microsoft.com/office/drawing/2016/5/14/chartex" xmlns:mc="http://schemas.openxmlformats.org/markup-compatibility/2006" xmlns:m="http://schemas.openxmlformats.org/officeDocument/2006/math" xmlns:aink="http://schemas.microsoft.com/office/drawing/2016/ink" xmlns:am3d="http://schemas.microsoft.com/office/drawing/2017/model3d" xmlns:oel="http://schemas.microsoft.com/office/2019/extlst" xmlns:r="http://schemas.openxmlformats.org/officeDocument/2006/relationships" xmlns:wp14="http://schemas.microsoft.com/office/word/2010/wordprocessingDrawing" xmlns:wp="http://schemas.openxmlformats.org/drawingml/2006/wordprocessingDrawing" xmlns:wpg="http://schemas.microsoft.com/office/word/2010/wordprocessingGroup" xmlns:wpi="http://schemas.microsoft.com/office/word/2010/wordprocessingInk" xmlns:wps="http://schemas.microsoft.com/office/word/2010/wordprocessingShape" xmlns:o="urn:schemas-microsoft-com:office:office" xmlns:v="urn:schemas-microsoft-com:vml" xmlns:w10="urn:schemas-microsoft-com:office:word" xmlns:w="http://schemas.openxmlformats.org/wordprocessingml/2006/main" xmlns:w14="http://schemas.microsoft.com/office/word/2010/wordml" xmlns:w15="http://schemas.microsoft.com/office/word/2012/wordml" xmlns:w16cex="http://schemas.microsoft.com/office/word/2018/wordml/cex" xmlns:w16cid="http://schemas.microsoft.com/office/word/2016/wordml/cid" xmlns:w16="http://schemas.microsoft.com/office/word/2018/wordml" xmlns:w16sdtdh="http://schemas.microsoft.com/office/word/2020/wordml/sdtdatahash" xmlns:w16sdtfl="http://schemas.microsoft.com/office/word/2024/wordml/sdtformatlock" xmlns:w16se="http://schemas.microsoft.com/office/word/2015/wordml/symex" xmlns:w16du="http://schemas.microsoft.com/office/word/2023/wordml/word16du" xmlns:wne="http://schemas.microsoft.com/office/word/2006/wordml" mc:Ignorable="w14 w15 w16se w16cid w16 w16cex w16sdtdh w16sdtfl w16du wp14">
+  <w:p>
+    <w:pPr>
+      <w:pStyle w:val="Header"/>
+      <w:pBdr>
+        <w:bottom w:val="single" w:sz="5" w:space="5" w:color="777777"/>
+      </w:pBdr>
+      <w:jc w:val="left"/>
+    </w:pPr>
+    <w:r>
+      <w:rPr>
+        <w:color w:val="4B4B4B"/>
+        <w:sz w:val="18"/>
+      </w:rPr>
+      <w:t>ЕЛЕМЕНТИ РАЗВОЈА СОФТВЕРА</w:t>
+    </w:r>
+  </w:p>
+</w:hdr>
 </file>
 
 <file path=word/numbering.xml><?xml version="1.0" encoding="utf-8"?>

</xml_diff>